<commit_message>
basic data convention added.
</commit_message>
<xml_diff>
--- a/report.docx
+++ b/report.docx
@@ -5,153 +5,227 @@
     <w:p>
       <w:pPr>
         <w:pStyle w:val="Title"/>
-        <w:spacing w:after="140" w:before="0" w:line="293" w:lineRule="auto"/>
-        <w:jc w:val="start"/>
-        <w:bidi w:val="1"/>
-      </w:pPr>
-      <w:r>
-        <w:rPr>
-          <w:rFonts w:ascii="Tahoma" w:hAnsi="Tahoma" w:eastAsia="Tahoma" w:cs="Tahoma"/>
+        <w:bidi/>
+        <w:spacing w:after="140" w:line="293" w:lineRule="auto"/>
+      </w:pPr>
+      <w:r>
+        <w:rPr>
+          <w:rFonts w:ascii="Tahoma" w:eastAsia="Tahoma" w:hAnsi="Tahoma" w:cs="Tahoma"/>
           <w:b/>
-          <w:color w:val="000000"/>
+          <w:bCs/>
           <w:sz w:val="30"/>
           <w:szCs w:val="30"/>
+          <w:rtl/>
           <w:lang w:val="fa-IR" w:bidi="fa-IR"/>
-          <w:rtl w:val="1"/>
-          <w:bCs w:val="1"/>
         </w:rPr>
         <w:t>گزارش تصمیم‌های کارخانه داده درخواست‌های شهری</w:t>
       </w:r>
     </w:p>
     <w:p>
       <w:pPr>
-        <w:spacing w:after="140" w:before="0" w:line="293" w:lineRule="auto"/>
-        <w:jc w:val="start"/>
-        <w:bidi w:val="1"/>
-      </w:pPr>
-      <w:r>
-        <w:rPr>
-          <w:rFonts w:ascii="Tahoma" w:hAnsi="Tahoma" w:eastAsia="Tahoma" w:cs="Tahoma"/>
-          <w:b w:val="0"/>
-          <w:color w:val="000000"/>
+        <w:bidi/>
+        <w:spacing w:after="140" w:line="293" w:lineRule="auto"/>
+        <w:rPr>
           <w:sz w:val="18"/>
           <w:szCs w:val="18"/>
+          <w:rtl/>
           <w:lang w:val="fa-IR" w:bidi="fa-IR"/>
-          <w:rtl w:val="1"/>
+        </w:rPr>
+      </w:pPr>
+      <w:r>
+        <w:rPr>
+          <w:sz w:val="18"/>
+          <w:szCs w:val="18"/>
+          <w:rtl/>
+          <w:lang w:val="fa-IR" w:bidi="fa-IR"/>
         </w:rPr>
         <w:t>نویسنده احسان سویزی</w:t>
       </w:r>
     </w:p>
     <w:p>
       <w:pPr>
+        <w:bidi/>
+        <w:spacing w:after="140" w:line="293" w:lineRule="auto"/>
+        <w:rPr>
+          <w:sz w:val="18"/>
+          <w:szCs w:val="18"/>
+          <w:rtl/>
+          <w:lang w:val="fa-IR" w:bidi="fa-IR"/>
+        </w:rPr>
+      </w:pPr>
+    </w:p>
+    <w:p>
+      <w:pPr>
+        <w:bidi/>
+        <w:spacing w:after="140" w:line="293" w:lineRule="auto"/>
+        <w:rPr>
+          <w:rFonts w:hint="cs"/>
+          <w:sz w:val="24"/>
+          <w:rtl/>
+          <w:lang w:bidi="fa-IR"/>
+        </w:rPr>
+      </w:pPr>
+      <w:r>
+        <w:rPr>
+          <w:rFonts w:hint="cs"/>
+          <w:sz w:val="24"/>
+          <w:rtl/>
+          <w:lang w:val="fa-IR" w:bidi="fa-IR"/>
+        </w:rPr>
+        <w:t xml:space="preserve">قبل از ورود به بخش اصلی این فایل یک فایل برای بخش </w:t>
+      </w:r>
+      <w:proofErr w:type="spellStart"/>
+      <w:r>
+        <w:rPr>
+          <w:sz w:val="24"/>
+          <w:lang w:bidi="fa-IR"/>
+        </w:rPr>
+        <w:t>data_undrestandtion</w:t>
+      </w:r>
+      <w:proofErr w:type="spellEnd"/>
+      <w:r>
+        <w:rPr>
+          <w:sz w:val="24"/>
+          <w:lang w:bidi="fa-IR"/>
+        </w:rPr>
+        <w:t xml:space="preserve"> </w:t>
+      </w:r>
+      <w:r>
+        <w:rPr>
+          <w:rFonts w:hint="cs"/>
+          <w:sz w:val="24"/>
+          <w:rtl/>
+          <w:lang w:bidi="fa-IR"/>
+        </w:rPr>
+        <w:t xml:space="preserve"> بصورت داک با کمک هوش مصنوعی اماده کردم چون وقت خوندن مستندات سایت </w:t>
+      </w:r>
+      <w:r>
+        <w:rPr>
+          <w:sz w:val="24"/>
+          <w:lang w:bidi="fa-IR"/>
+        </w:rPr>
+        <w:t xml:space="preserve">data provider </w:t>
+      </w:r>
+      <w:r>
+        <w:rPr>
+          <w:rFonts w:hint="cs"/>
+          <w:sz w:val="24"/>
+          <w:rtl/>
+          <w:lang w:bidi="fa-IR"/>
+        </w:rPr>
+        <w:t xml:space="preserve"> رو نداشتم ولی در یک فایل داکیومنت جدا گذاشتم تا این فایل زیادی شلوغ نشه.</w:t>
+      </w:r>
+    </w:p>
+    <w:p>
+      <w:pPr>
         <w:pStyle w:val="Heading2"/>
-        <w:spacing w:after="100" w:before="80" w:line="293" w:lineRule="auto"/>
-        <w:jc w:val="start"/>
-        <w:keepNext/>
-        <w:bidi w:val="1"/>
-      </w:pPr>
-      <w:r>
-        <w:rPr>
-          <w:rFonts w:ascii="Tahoma" w:hAnsi="Tahoma" w:eastAsia="Tahoma" w:cs="Tahoma"/>
+        <w:bidi/>
+        <w:spacing w:before="80" w:after="100" w:line="293" w:lineRule="auto"/>
+      </w:pPr>
+      <w:r>
+        <w:rPr>
+          <w:rFonts w:ascii="Tahoma" w:eastAsia="Tahoma" w:hAnsi="Tahoma" w:cs="Tahoma"/>
           <w:b/>
-          <w:color w:val="000000"/>
+          <w:bCs/>
           <w:sz w:val="23"/>
           <w:szCs w:val="23"/>
+          <w:rtl/>
           <w:lang w:val="fa-IR" w:bidi="fa-IR"/>
-          <w:rtl w:val="1"/>
-          <w:bCs w:val="1"/>
         </w:rPr>
         <w:t>هدف و دامنه انتخاب‌شده</w:t>
       </w:r>
     </w:p>
     <w:p>
       <w:pPr>
-        <w:spacing w:after="120" w:before="0" w:line="293" w:lineRule="auto"/>
-        <w:jc w:val="start"/>
-        <w:bidi w:val="1"/>
-      </w:pPr>
-      <w:r>
-        <w:rPr>
-          <w:rFonts w:ascii="Tahoma" w:hAnsi="Tahoma" w:eastAsia="Tahoma" w:cs="Tahoma"/>
-          <w:b w:val="0"/>
-          <w:color w:val="000000"/>
-          <w:sz w:val="21"/>
-          <w:szCs w:val="21"/>
+        <w:bidi/>
+        <w:spacing w:after="120" w:line="293" w:lineRule="auto"/>
+        <w:rPr>
+          <w:szCs w:val="21"/>
+          <w:rtl/>
+          <w:lang w:bidi="fa-IR"/>
+        </w:rPr>
+      </w:pPr>
+      <w:r>
+        <w:rPr>
+          <w:szCs w:val="21"/>
+          <w:rtl/>
           <w:lang w:val="fa-IR" w:bidi="fa-IR"/>
-          <w:rtl w:val="1"/>
         </w:rPr>
         <w:t xml:space="preserve">هدف این مرحله تهیه داده قابل اتکا برای بررسی مدت بسته‌شدن درخواست‌ها و مقایسه آن بر حسب مکان، نوع شکایت و ماه است. منبع اصلی، داده عمومی سامانه </w:t>
       </w:r>
       <w:r>
         <w:rPr>
-          <w:rFonts w:ascii="Tahoma" w:hAnsi="Tahoma" w:eastAsia="Tahoma" w:cs="Tahoma"/>
-          <w:b w:val="0"/>
-          <w:color w:val="000000"/>
-          <w:sz w:val="21"/>
           <w:szCs w:val="21"/>
           <w:lang w:val="fa-IR" w:bidi="fa-IR"/>
-          <w:rtl w:val="0"/>
         </w:rPr>
         <w:t>NYC311</w:t>
       </w:r>
       <w:r>
         <w:rPr>
-          <w:rFonts w:ascii="Tahoma" w:hAnsi="Tahoma" w:eastAsia="Tahoma" w:cs="Tahoma"/>
-          <w:b w:val="0"/>
-          <w:color w:val="000000"/>
-          <w:sz w:val="21"/>
-          <w:szCs w:val="21"/>
+          <w:szCs w:val="21"/>
+          <w:rtl/>
           <w:lang w:val="fa-IR" w:bidi="fa-IR"/>
-          <w:rtl w:val="1"/>
         </w:rPr>
         <w:t xml:space="preserve"> با شناسه </w:t>
       </w:r>
       <w:r>
         <w:rPr>
-          <w:rFonts w:ascii="Tahoma" w:hAnsi="Tahoma" w:eastAsia="Tahoma" w:cs="Tahoma"/>
-          <w:b w:val="0"/>
-          <w:color w:val="000000"/>
-          <w:sz w:val="21"/>
           <w:szCs w:val="21"/>
           <w:lang w:val="fa-IR" w:bidi="fa-IR"/>
-          <w:rtl w:val="0"/>
         </w:rPr>
         <w:t>erm2-nwe9</w:t>
       </w:r>
       <w:r>
         <w:rPr>
-          <w:rFonts w:ascii="Tahoma" w:hAnsi="Tahoma" w:eastAsia="Tahoma" w:cs="Tahoma"/>
-          <w:b w:val="0"/>
-          <w:color w:val="000000"/>
-          <w:sz w:val="21"/>
-          <w:szCs w:val="21"/>
+          <w:szCs w:val="21"/>
+          <w:rtl/>
           <w:lang w:val="fa-IR" w:bidi="fa-IR"/>
-          <w:rtl w:val="1"/>
-        </w:rPr>
-        <w:t xml:space="preserve"> است. دامنه دریافت را از انتخاب مکانی بروکلین به پنج نوع مشخص شکایت سر‌وصدا در کل نیویورک تغییر دادم.</w:t>
+        </w:rPr>
+        <w:t xml:space="preserve"> است. </w:t>
+      </w:r>
+    </w:p>
+    <w:p>
+      <w:pPr>
+        <w:bidi/>
+        <w:spacing w:after="120" w:line="293" w:lineRule="auto"/>
+        <w:rPr>
+          <w:rFonts w:hint="cs"/>
+          <w:szCs w:val="21"/>
+          <w:rtl/>
+          <w:lang w:bidi="fa-IR"/>
+        </w:rPr>
+      </w:pPr>
+      <w:r>
+        <w:rPr>
+          <w:rFonts w:hint="cs"/>
+          <w:szCs w:val="21"/>
+          <w:rtl/>
+          <w:lang w:bidi="fa-IR"/>
+        </w:rPr>
+        <w:t>محدودیت اعمال شده برای انتخاب ریکورد ها در یک بازه زمانی ۱۸ ماهه مشخص یک فیلتر روی نوع شکایات هست و تنها شامل ۵ بخش از شکایاتی میشود که مربوط به سروصدا میباشند.</w:t>
       </w:r>
     </w:p>
     <w:tbl>
       <w:tblPr>
-        <w:tblW w:type="dxa" w:w="9865"/>
+        <w:bidiVisual/>
+        <w:tblW w:w="9865" w:type="dxa"/>
         <w:jc w:val="center"/>
+        <w:tblBorders>
+          <w:top w:val="single" w:sz="4" w:space="0" w:color="D9D9D9"/>
+          <w:left w:val="single" w:sz="4" w:space="0" w:color="D9D9D9"/>
+          <w:bottom w:val="single" w:sz="4" w:space="0" w:color="D9D9D9"/>
+          <w:right w:val="single" w:sz="4" w:space="0" w:color="D9D9D9"/>
+          <w:insideH w:val="single" w:sz="4" w:space="0" w:color="D9D9D9"/>
+          <w:insideV w:val="single" w:sz="4" w:space="0" w:color="D9D9D9"/>
+        </w:tblBorders>
         <w:tblLayout w:type="fixed"/>
-        <w:tblLook w:firstColumn="1" w:firstRow="1" w:lastColumn="0" w:lastRow="0" w:noHBand="0" w:noVBand="1" w:val="04A0"/>
-        <w:bidiVisual w:val="1"/>
-        <w:tblBorders>
-          <w:top w:val="single" w:sz="4" w:color="D9D9D9"/>
-          <w:left w:val="single" w:sz="4" w:color="D9D9D9"/>
-          <w:bottom w:val="single" w:sz="4" w:color="D9D9D9"/>
-          <w:right w:val="single" w:sz="4" w:color="D9D9D9"/>
-          <w:insideH w:val="single" w:sz="4" w:color="D9D9D9"/>
-          <w:insideV w:val="single" w:sz="4" w:color="D9D9D9"/>
-        </w:tblBorders>
         <w:tblCellMar>
           <w:top w:w="85" w:type="dxa"/>
+          <w:left w:w="90" w:type="dxa"/>
           <w:bottom w:w="85" w:type="dxa"/>
-          <w:left w:w="90" w:type="dxa"/>
           <w:right w:w="90" w:type="dxa"/>
         </w:tblCellMar>
+        <w:tblLook w:val="04A0" w:firstRow="1" w:lastRow="0" w:firstColumn="1" w:lastColumn="0" w:noHBand="0" w:noVBand="1"/>
       </w:tblPr>
       <w:tblGrid>
         <w:gridCol w:w="2041"/>
@@ -161,29 +235,28 @@
         <w:trPr>
           <w:cantSplit/>
           <w:tblHeader/>
+          <w:jc w:val="center"/>
         </w:trPr>
         <w:tc>
           <w:tcPr>
-            <w:tcW w:type="dxa" w:w="2041"/>
+            <w:tcW w:w="2041" w:type="dxa"/>
+            <w:shd w:val="clear" w:color="auto" w:fill="264C63"/>
             <w:vAlign w:val="center"/>
-            <w:shd w:fill="264C63"/>
           </w:tcPr>
           <w:p>
             <w:pPr>
-              <w:spacing w:after="0" w:before="0" w:line="274" w:lineRule="auto"/>
-              <w:jc w:val="start"/>
-              <w:bidi w:val="1"/>
+              <w:bidi/>
+              <w:spacing w:after="0" w:line="274" w:lineRule="auto"/>
             </w:pPr>
             <w:r>
               <w:rPr>
-                <w:rFonts w:ascii="Tahoma" w:hAnsi="Tahoma" w:eastAsia="Tahoma" w:cs="Tahoma"/>
                 <w:b/>
+                <w:bCs/>
                 <w:color w:val="FFFFFF"/>
                 <w:sz w:val="18"/>
                 <w:szCs w:val="18"/>
-                <w:lang w:val="fa-IR" w:bidi="fa-IR"/>
-                <w:rtl w:val="1"/>
-                <w:bCs w:val="1"/>
+                <w:rtl/>
+                <w:lang w:val="fa-IR" w:bidi="fa-IR"/>
               </w:rPr>
               <w:t>تصمیم</w:t>
             </w:r>
@@ -191,26 +264,24 @@
         </w:tc>
         <w:tc>
           <w:tcPr>
-            <w:tcW w:type="dxa" w:w="7824"/>
+            <w:tcW w:w="7824" w:type="dxa"/>
+            <w:shd w:val="clear" w:color="auto" w:fill="264C63"/>
             <w:vAlign w:val="center"/>
-            <w:shd w:fill="264C63"/>
           </w:tcPr>
           <w:p>
             <w:pPr>
-              <w:spacing w:after="0" w:before="0" w:line="274" w:lineRule="auto"/>
-              <w:jc w:val="start"/>
-              <w:bidi w:val="1"/>
+              <w:bidi/>
+              <w:spacing w:after="0" w:line="274" w:lineRule="auto"/>
             </w:pPr>
             <w:r>
               <w:rPr>
-                <w:rFonts w:ascii="Tahoma" w:hAnsi="Tahoma" w:eastAsia="Tahoma" w:cs="Tahoma"/>
                 <w:b/>
+                <w:bCs/>
                 <w:color w:val="FFFFFF"/>
                 <w:sz w:val="18"/>
                 <w:szCs w:val="18"/>
-                <w:lang w:val="fa-IR" w:bidi="fa-IR"/>
-                <w:rtl w:val="1"/>
-                <w:bCs w:val="1"/>
+                <w:rtl/>
+                <w:lang w:val="fa-IR" w:bidi="fa-IR"/>
               </w:rPr>
               <w:t>مقدار ثبت‌شده در تنظیمات</w:t>
             </w:r>
@@ -220,28 +291,25 @@
       <w:tr>
         <w:trPr>
           <w:cantSplit/>
+          <w:jc w:val="center"/>
         </w:trPr>
         <w:tc>
           <w:tcPr>
-            <w:tcW w:type="dxa" w:w="2041"/>
+            <w:tcW w:w="2041" w:type="dxa"/>
+            <w:shd w:val="clear" w:color="auto" w:fill="FFFFFF"/>
             <w:vAlign w:val="center"/>
-            <w:shd w:fill="FFFFFF"/>
           </w:tcPr>
           <w:p>
             <w:pPr>
-              <w:spacing w:after="0" w:before="0" w:line="274" w:lineRule="auto"/>
-              <w:jc w:val="start"/>
-              <w:bidi w:val="1"/>
+              <w:bidi/>
+              <w:spacing w:after="0" w:line="274" w:lineRule="auto"/>
             </w:pPr>
             <w:r>
               <w:rPr>
-                <w:rFonts w:ascii="Tahoma" w:hAnsi="Tahoma" w:eastAsia="Tahoma" w:cs="Tahoma"/>
-                <w:b w:val="0"/>
-                <w:color w:val="000000"/>
-                <w:sz w:val="18"/>
-                <w:szCs w:val="18"/>
-                <w:lang w:val="fa-IR" w:bidi="fa-IR"/>
-                <w:rtl w:val="1"/>
+                <w:sz w:val="18"/>
+                <w:szCs w:val="18"/>
+                <w:rtl/>
+                <w:lang w:val="fa-IR" w:bidi="fa-IR"/>
               </w:rPr>
               <w:t>بازه ثبت پرونده</w:t>
             </w:r>
@@ -249,73 +317,55 @@
         </w:tc>
         <w:tc>
           <w:tcPr>
-            <w:tcW w:type="dxa" w:w="7824"/>
+            <w:tcW w:w="7824" w:type="dxa"/>
+            <w:shd w:val="clear" w:color="auto" w:fill="FFFFFF"/>
             <w:vAlign w:val="center"/>
-            <w:shd w:fill="FFFFFF"/>
           </w:tcPr>
           <w:p>
             <w:pPr>
-              <w:spacing w:after="0" w:before="0" w:line="274" w:lineRule="auto"/>
-              <w:jc w:val="start"/>
-              <w:bidi w:val="1"/>
+              <w:bidi/>
+              <w:spacing w:after="0" w:line="274" w:lineRule="auto"/>
             </w:pPr>
             <w:r>
               <w:rPr>
-                <w:rFonts w:ascii="Tahoma" w:hAnsi="Tahoma" w:eastAsia="Tahoma" w:cs="Tahoma"/>
-                <w:b w:val="0"/>
-                <w:color w:val="000000"/>
-                <w:sz w:val="18"/>
-                <w:szCs w:val="18"/>
-                <w:lang w:val="fa-IR" w:bidi="fa-IR"/>
-                <w:rtl w:val="1"/>
+                <w:sz w:val="18"/>
+                <w:szCs w:val="18"/>
+                <w:rtl/>
+                <w:lang w:val="fa-IR" w:bidi="fa-IR"/>
               </w:rPr>
               <w:t xml:space="preserve">از </w:t>
             </w:r>
             <w:r>
               <w:rPr>
-                <w:rFonts w:ascii="Tahoma" w:hAnsi="Tahoma" w:eastAsia="Tahoma" w:cs="Tahoma"/>
-                <w:b w:val="0"/>
-                <w:color w:val="000000"/>
-                <w:sz w:val="18"/>
-                <w:szCs w:val="18"/>
-                <w:lang w:val="fa-IR" w:bidi="fa-IR"/>
-                <w:rtl w:val="0"/>
+                <w:sz w:val="18"/>
+                <w:szCs w:val="18"/>
+                <w:lang w:val="fa-IR" w:bidi="fa-IR"/>
               </w:rPr>
               <w:t>2024-01-01</w:t>
             </w:r>
             <w:r>
               <w:rPr>
-                <w:rFonts w:ascii="Tahoma" w:hAnsi="Tahoma" w:eastAsia="Tahoma" w:cs="Tahoma"/>
-                <w:b w:val="0"/>
-                <w:color w:val="000000"/>
-                <w:sz w:val="18"/>
-                <w:szCs w:val="18"/>
-                <w:lang w:val="fa-IR" w:bidi="fa-IR"/>
-                <w:rtl w:val="1"/>
+                <w:sz w:val="18"/>
+                <w:szCs w:val="18"/>
+                <w:rtl/>
+                <w:lang w:val="fa-IR" w:bidi="fa-IR"/>
               </w:rPr>
               <w:t xml:space="preserve"> شامل شروع تا </w:t>
             </w:r>
             <w:r>
               <w:rPr>
-                <w:rFonts w:ascii="Tahoma" w:hAnsi="Tahoma" w:eastAsia="Tahoma" w:cs="Tahoma"/>
-                <w:b w:val="0"/>
-                <w:color w:val="000000"/>
-                <w:sz w:val="18"/>
-                <w:szCs w:val="18"/>
-                <w:lang w:val="fa-IR" w:bidi="fa-IR"/>
-                <w:rtl w:val="0"/>
+                <w:sz w:val="18"/>
+                <w:szCs w:val="18"/>
+                <w:lang w:val="fa-IR" w:bidi="fa-IR"/>
               </w:rPr>
               <w:t>2025-07-01</w:t>
             </w:r>
             <w:r>
               <w:rPr>
-                <w:rFonts w:ascii="Tahoma" w:hAnsi="Tahoma" w:eastAsia="Tahoma" w:cs="Tahoma"/>
-                <w:b w:val="0"/>
-                <w:color w:val="000000"/>
-                <w:sz w:val="18"/>
-                <w:szCs w:val="18"/>
-                <w:lang w:val="fa-IR" w:bidi="fa-IR"/>
-                <w:rtl w:val="1"/>
+                <w:sz w:val="18"/>
+                <w:szCs w:val="18"/>
+                <w:rtl/>
+                <w:lang w:val="fa-IR" w:bidi="fa-IR"/>
               </w:rPr>
               <w:t xml:space="preserve"> بدون شامل‌شدن پایان؛ ۱۸ ماه کامل</w:t>
             </w:r>
@@ -325,28 +375,25 @@
       <w:tr>
         <w:trPr>
           <w:cantSplit/>
+          <w:jc w:val="center"/>
         </w:trPr>
         <w:tc>
           <w:tcPr>
-            <w:tcW w:type="dxa" w:w="2041"/>
+            <w:tcW w:w="2041" w:type="dxa"/>
+            <w:shd w:val="clear" w:color="auto" w:fill="F1F5F8"/>
             <w:vAlign w:val="center"/>
-            <w:shd w:fill="F1F5F8"/>
           </w:tcPr>
           <w:p>
             <w:pPr>
-              <w:spacing w:after="0" w:before="0" w:line="274" w:lineRule="auto"/>
-              <w:jc w:val="start"/>
-              <w:bidi w:val="1"/>
+              <w:bidi/>
+              <w:spacing w:after="0" w:line="274" w:lineRule="auto"/>
             </w:pPr>
             <w:r>
               <w:rPr>
-                <w:rFonts w:ascii="Tahoma" w:hAnsi="Tahoma" w:eastAsia="Tahoma" w:cs="Tahoma"/>
-                <w:b w:val="0"/>
-                <w:color w:val="000000"/>
-                <w:sz w:val="18"/>
-                <w:szCs w:val="18"/>
-                <w:lang w:val="fa-IR" w:bidi="fa-IR"/>
-                <w:rtl w:val="1"/>
+                <w:sz w:val="18"/>
+                <w:szCs w:val="18"/>
+                <w:rtl/>
+                <w:lang w:val="fa-IR" w:bidi="fa-IR"/>
               </w:rPr>
               <w:t>محدوده مکانی</w:t>
             </w:r>
@@ -354,49 +401,38 @@
         </w:tc>
         <w:tc>
           <w:tcPr>
-            <w:tcW w:type="dxa" w:w="7824"/>
+            <w:tcW w:w="7824" w:type="dxa"/>
+            <w:shd w:val="clear" w:color="auto" w:fill="F1F5F8"/>
             <w:vAlign w:val="center"/>
-            <w:shd w:fill="F1F5F8"/>
           </w:tcPr>
           <w:p>
             <w:pPr>
-              <w:spacing w:after="0" w:before="0" w:line="274" w:lineRule="auto"/>
-              <w:jc w:val="start"/>
-              <w:bidi w:val="1"/>
+              <w:bidi/>
+              <w:spacing w:after="0" w:line="274" w:lineRule="auto"/>
             </w:pPr>
             <w:r>
               <w:rPr>
-                <w:rFonts w:ascii="Tahoma" w:hAnsi="Tahoma" w:eastAsia="Tahoma" w:cs="Tahoma"/>
-                <w:b w:val="0"/>
-                <w:color w:val="000000"/>
-                <w:sz w:val="18"/>
-                <w:szCs w:val="18"/>
-                <w:lang w:val="fa-IR" w:bidi="fa-IR"/>
-                <w:rtl w:val="1"/>
+                <w:sz w:val="18"/>
+                <w:szCs w:val="18"/>
+                <w:rtl/>
+                <w:lang w:val="fa-IR" w:bidi="fa-IR"/>
               </w:rPr>
               <w:t xml:space="preserve">بدون فیلتر </w:t>
             </w:r>
             <w:r>
               <w:rPr>
-                <w:rFonts w:ascii="Tahoma" w:hAnsi="Tahoma" w:eastAsia="Tahoma" w:cs="Tahoma"/>
-                <w:b w:val="0"/>
-                <w:color w:val="000000"/>
-                <w:sz w:val="18"/>
-                <w:szCs w:val="18"/>
-                <w:lang w:val="fa-IR" w:bidi="fa-IR"/>
-                <w:rtl w:val="0"/>
+                <w:sz w:val="18"/>
+                <w:szCs w:val="18"/>
+                <w:lang w:val="fa-IR" w:bidi="fa-IR"/>
               </w:rPr>
               <w:t>borough</w:t>
             </w:r>
             <w:r>
               <w:rPr>
-                <w:rFonts w:ascii="Tahoma" w:hAnsi="Tahoma" w:eastAsia="Tahoma" w:cs="Tahoma"/>
-                <w:b w:val="0"/>
-                <w:color w:val="000000"/>
-                <w:sz w:val="18"/>
-                <w:szCs w:val="18"/>
-                <w:lang w:val="fa-IR" w:bidi="fa-IR"/>
-                <w:rtl w:val="1"/>
+                <w:sz w:val="18"/>
+                <w:szCs w:val="18"/>
+                <w:rtl/>
+                <w:lang w:val="fa-IR" w:bidi="fa-IR"/>
               </w:rPr>
               <w:t>؛ مناطق مختلف نیویورک در دامنه قرار دارند</w:t>
             </w:r>
@@ -406,28 +442,25 @@
       <w:tr>
         <w:trPr>
           <w:cantSplit/>
+          <w:jc w:val="center"/>
         </w:trPr>
         <w:tc>
           <w:tcPr>
-            <w:tcW w:type="dxa" w:w="2041"/>
+            <w:tcW w:w="2041" w:type="dxa"/>
+            <w:shd w:val="clear" w:color="auto" w:fill="FFFFFF"/>
             <w:vAlign w:val="center"/>
-            <w:shd w:fill="FFFFFF"/>
           </w:tcPr>
           <w:p>
             <w:pPr>
-              <w:spacing w:after="0" w:before="0" w:line="274" w:lineRule="auto"/>
-              <w:jc w:val="start"/>
-              <w:bidi w:val="1"/>
+              <w:bidi/>
+              <w:spacing w:after="0" w:line="274" w:lineRule="auto"/>
             </w:pPr>
             <w:r>
               <w:rPr>
-                <w:rFonts w:ascii="Tahoma" w:hAnsi="Tahoma" w:eastAsia="Tahoma" w:cs="Tahoma"/>
-                <w:b w:val="0"/>
-                <w:color w:val="000000"/>
-                <w:sz w:val="18"/>
-                <w:szCs w:val="18"/>
-                <w:lang w:val="fa-IR" w:bidi="fa-IR"/>
-                <w:rtl w:val="1"/>
+                <w:sz w:val="18"/>
+                <w:szCs w:val="18"/>
+                <w:rtl/>
+                <w:lang w:val="fa-IR" w:bidi="fa-IR"/>
               </w:rPr>
               <w:t>نوع شکایت</w:t>
             </w:r>
@@ -435,121 +468,88 @@
         </w:tc>
         <w:tc>
           <w:tcPr>
-            <w:tcW w:type="dxa" w:w="7824"/>
+            <w:tcW w:w="7824" w:type="dxa"/>
+            <w:shd w:val="clear" w:color="auto" w:fill="FFFFFF"/>
             <w:vAlign w:val="center"/>
-            <w:shd w:fill="FFFFFF"/>
           </w:tcPr>
           <w:p>
             <w:pPr>
-              <w:spacing w:after="0" w:before="0" w:line="274" w:lineRule="auto"/>
-              <w:jc w:val="start"/>
-              <w:bidi w:val="1"/>
+              <w:bidi/>
+              <w:spacing w:after="0" w:line="274" w:lineRule="auto"/>
             </w:pPr>
             <w:r>
               <w:rPr>
-                <w:rFonts w:ascii="Tahoma" w:hAnsi="Tahoma" w:eastAsia="Tahoma" w:cs="Tahoma"/>
-                <w:b w:val="0"/>
-                <w:color w:val="000000"/>
-                <w:sz w:val="18"/>
-                <w:szCs w:val="18"/>
-                <w:lang w:val="fa-IR" w:bidi="fa-IR"/>
-                <w:rtl w:val="0"/>
+                <w:sz w:val="18"/>
+                <w:szCs w:val="18"/>
+                <w:lang w:val="fa-IR" w:bidi="fa-IR"/>
               </w:rPr>
               <w:t>Noise - Residential</w:t>
             </w:r>
             <w:r>
               <w:rPr>
-                <w:rFonts w:ascii="Tahoma" w:hAnsi="Tahoma" w:eastAsia="Tahoma" w:cs="Tahoma"/>
-                <w:b w:val="0"/>
-                <w:color w:val="000000"/>
-                <w:sz w:val="18"/>
-                <w:szCs w:val="18"/>
-                <w:lang w:val="fa-IR" w:bidi="fa-IR"/>
-                <w:rtl w:val="1"/>
+                <w:sz w:val="18"/>
+                <w:szCs w:val="18"/>
+                <w:rtl/>
+                <w:lang w:val="fa-IR" w:bidi="fa-IR"/>
               </w:rPr>
               <w:br/>
             </w:r>
             <w:r>
               <w:rPr>
-                <w:rFonts w:ascii="Tahoma" w:hAnsi="Tahoma" w:eastAsia="Tahoma" w:cs="Tahoma"/>
-                <w:b w:val="0"/>
-                <w:color w:val="000000"/>
-                <w:sz w:val="18"/>
-                <w:szCs w:val="18"/>
-                <w:lang w:val="fa-IR" w:bidi="fa-IR"/>
-                <w:rtl w:val="0"/>
+                <w:sz w:val="18"/>
+                <w:szCs w:val="18"/>
+                <w:lang w:val="fa-IR" w:bidi="fa-IR"/>
               </w:rPr>
               <w:t>Noise - Vehicle</w:t>
             </w:r>
             <w:r>
               <w:rPr>
-                <w:rFonts w:ascii="Tahoma" w:hAnsi="Tahoma" w:eastAsia="Tahoma" w:cs="Tahoma"/>
-                <w:b w:val="0"/>
-                <w:color w:val="000000"/>
-                <w:sz w:val="18"/>
-                <w:szCs w:val="18"/>
-                <w:lang w:val="fa-IR" w:bidi="fa-IR"/>
-                <w:rtl w:val="1"/>
+                <w:sz w:val="18"/>
+                <w:szCs w:val="18"/>
+                <w:rtl/>
+                <w:lang w:val="fa-IR" w:bidi="fa-IR"/>
               </w:rPr>
               <w:br/>
             </w:r>
             <w:r>
               <w:rPr>
-                <w:rFonts w:ascii="Tahoma" w:hAnsi="Tahoma" w:eastAsia="Tahoma" w:cs="Tahoma"/>
-                <w:b w:val="0"/>
-                <w:color w:val="000000"/>
-                <w:sz w:val="18"/>
-                <w:szCs w:val="18"/>
-                <w:lang w:val="fa-IR" w:bidi="fa-IR"/>
-                <w:rtl w:val="0"/>
+                <w:sz w:val="18"/>
+                <w:szCs w:val="18"/>
+                <w:lang w:val="fa-IR" w:bidi="fa-IR"/>
               </w:rPr>
               <w:t>Noise - Street/Sidewalk</w:t>
             </w:r>
             <w:r>
               <w:rPr>
-                <w:rFonts w:ascii="Tahoma" w:hAnsi="Tahoma" w:eastAsia="Tahoma" w:cs="Tahoma"/>
-                <w:b w:val="0"/>
-                <w:color w:val="000000"/>
-                <w:sz w:val="18"/>
-                <w:szCs w:val="18"/>
-                <w:lang w:val="fa-IR" w:bidi="fa-IR"/>
-                <w:rtl w:val="1"/>
+                <w:sz w:val="18"/>
+                <w:szCs w:val="18"/>
+                <w:rtl/>
+                <w:lang w:val="fa-IR" w:bidi="fa-IR"/>
               </w:rPr>
               <w:br/>
             </w:r>
             <w:r>
               <w:rPr>
-                <w:rFonts w:ascii="Tahoma" w:hAnsi="Tahoma" w:eastAsia="Tahoma" w:cs="Tahoma"/>
-                <w:b w:val="0"/>
-                <w:color w:val="000000"/>
-                <w:sz w:val="18"/>
-                <w:szCs w:val="18"/>
-                <w:lang w:val="fa-IR" w:bidi="fa-IR"/>
-                <w:rtl w:val="0"/>
+                <w:sz w:val="18"/>
+                <w:szCs w:val="18"/>
+                <w:lang w:val="fa-IR" w:bidi="fa-IR"/>
               </w:rPr>
               <w:t>Noise - Park</w:t>
             </w:r>
             <w:r>
               <w:rPr>
-                <w:rFonts w:ascii="Tahoma" w:hAnsi="Tahoma" w:eastAsia="Tahoma" w:cs="Tahoma"/>
-                <w:b w:val="0"/>
-                <w:color w:val="000000"/>
-                <w:sz w:val="18"/>
-                <w:szCs w:val="18"/>
-                <w:lang w:val="fa-IR" w:bidi="fa-IR"/>
-                <w:rtl w:val="1"/>
+                <w:sz w:val="18"/>
+                <w:szCs w:val="18"/>
+                <w:rtl/>
+                <w:lang w:val="fa-IR" w:bidi="fa-IR"/>
               </w:rPr>
               <w:br/>
             </w:r>
             <w:r>
               <w:rPr>
-                <w:rFonts w:ascii="Tahoma" w:hAnsi="Tahoma" w:eastAsia="Tahoma" w:cs="Tahoma"/>
-                <w:b w:val="0"/>
-                <w:color w:val="000000"/>
-                <w:sz w:val="18"/>
-                <w:szCs w:val="18"/>
-                <w:lang w:val="fa-IR" w:bidi="fa-IR"/>
-                <w:rtl w:val="0"/>
+                <w:sz w:val="18"/>
+                <w:szCs w:val="18"/>
+                <w:lang w:val="fa-IR" w:bidi="fa-IR"/>
               </w:rPr>
               <w:t>Noise - Commercial</w:t>
             </w:r>
@@ -559,28 +559,25 @@
       <w:tr>
         <w:trPr>
           <w:cantSplit/>
+          <w:jc w:val="center"/>
         </w:trPr>
         <w:tc>
           <w:tcPr>
-            <w:tcW w:type="dxa" w:w="2041"/>
+            <w:tcW w:w="2041" w:type="dxa"/>
+            <w:shd w:val="clear" w:color="auto" w:fill="F1F5F8"/>
             <w:vAlign w:val="center"/>
-            <w:shd w:fill="F1F5F8"/>
           </w:tcPr>
           <w:p>
             <w:pPr>
-              <w:spacing w:after="0" w:before="0" w:line="274" w:lineRule="auto"/>
-              <w:jc w:val="start"/>
-              <w:bidi w:val="1"/>
+              <w:bidi/>
+              <w:spacing w:after="0" w:line="274" w:lineRule="auto"/>
             </w:pPr>
             <w:r>
               <w:rPr>
-                <w:rFonts w:ascii="Tahoma" w:hAnsi="Tahoma" w:eastAsia="Tahoma" w:cs="Tahoma"/>
-                <w:b w:val="0"/>
-                <w:color w:val="000000"/>
-                <w:sz w:val="18"/>
-                <w:szCs w:val="18"/>
-                <w:lang w:val="fa-IR" w:bidi="fa-IR"/>
-                <w:rtl w:val="1"/>
+                <w:sz w:val="18"/>
+                <w:szCs w:val="18"/>
+                <w:rtl/>
+                <w:lang w:val="fa-IR" w:bidi="fa-IR"/>
               </w:rPr>
               <w:t>وضعیت و سازمان</w:t>
             </w:r>
@@ -588,73 +585,55 @@
         </w:tc>
         <w:tc>
           <w:tcPr>
-            <w:tcW w:type="dxa" w:w="7824"/>
+            <w:tcW w:w="7824" w:type="dxa"/>
+            <w:shd w:val="clear" w:color="auto" w:fill="F1F5F8"/>
             <w:vAlign w:val="center"/>
-            <w:shd w:fill="F1F5F8"/>
           </w:tcPr>
           <w:p>
             <w:pPr>
-              <w:spacing w:after="0" w:before="0" w:line="274" w:lineRule="auto"/>
-              <w:jc w:val="start"/>
-              <w:bidi w:val="1"/>
+              <w:bidi/>
+              <w:spacing w:after="0" w:line="274" w:lineRule="auto"/>
             </w:pPr>
             <w:r>
               <w:rPr>
-                <w:rFonts w:ascii="Tahoma" w:hAnsi="Tahoma" w:eastAsia="Tahoma" w:cs="Tahoma"/>
-                <w:b w:val="0"/>
-                <w:color w:val="000000"/>
-                <w:sz w:val="18"/>
-                <w:szCs w:val="18"/>
-                <w:lang w:val="fa-IR" w:bidi="fa-IR"/>
-                <w:rtl w:val="1"/>
+                <w:sz w:val="18"/>
+                <w:szCs w:val="18"/>
+                <w:rtl/>
+                <w:lang w:val="fa-IR" w:bidi="fa-IR"/>
               </w:rPr>
               <w:t xml:space="preserve">فیلتر اختصاصی برای </w:t>
             </w:r>
             <w:r>
               <w:rPr>
-                <w:rFonts w:ascii="Tahoma" w:hAnsi="Tahoma" w:eastAsia="Tahoma" w:cs="Tahoma"/>
-                <w:b w:val="0"/>
-                <w:color w:val="000000"/>
-                <w:sz w:val="18"/>
-                <w:szCs w:val="18"/>
-                <w:lang w:val="fa-IR" w:bidi="fa-IR"/>
-                <w:rtl w:val="0"/>
+                <w:sz w:val="18"/>
+                <w:szCs w:val="18"/>
+                <w:lang w:val="fa-IR" w:bidi="fa-IR"/>
               </w:rPr>
               <w:t>status</w:t>
             </w:r>
             <w:r>
               <w:rPr>
-                <w:rFonts w:ascii="Tahoma" w:hAnsi="Tahoma" w:eastAsia="Tahoma" w:cs="Tahoma"/>
-                <w:b w:val="0"/>
-                <w:color w:val="000000"/>
-                <w:sz w:val="18"/>
-                <w:szCs w:val="18"/>
-                <w:lang w:val="fa-IR" w:bidi="fa-IR"/>
-                <w:rtl w:val="1"/>
+                <w:sz w:val="18"/>
+                <w:szCs w:val="18"/>
+                <w:rtl/>
+                <w:lang w:val="fa-IR" w:bidi="fa-IR"/>
               </w:rPr>
               <w:t xml:space="preserve"> یا </w:t>
             </w:r>
             <w:r>
               <w:rPr>
-                <w:rFonts w:ascii="Tahoma" w:hAnsi="Tahoma" w:eastAsia="Tahoma" w:cs="Tahoma"/>
-                <w:b w:val="0"/>
-                <w:color w:val="000000"/>
-                <w:sz w:val="18"/>
-                <w:szCs w:val="18"/>
-                <w:lang w:val="fa-IR" w:bidi="fa-IR"/>
-                <w:rtl w:val="0"/>
+                <w:sz w:val="18"/>
+                <w:szCs w:val="18"/>
+                <w:lang w:val="fa-IR" w:bidi="fa-IR"/>
               </w:rPr>
               <w:t>agency</w:t>
             </w:r>
             <w:r>
               <w:rPr>
-                <w:rFonts w:ascii="Tahoma" w:hAnsi="Tahoma" w:eastAsia="Tahoma" w:cs="Tahoma"/>
-                <w:b w:val="0"/>
-                <w:color w:val="000000"/>
-                <w:sz w:val="18"/>
-                <w:szCs w:val="18"/>
-                <w:lang w:val="fa-IR" w:bidi="fa-IR"/>
-                <w:rtl w:val="1"/>
+                <w:sz w:val="18"/>
+                <w:szCs w:val="18"/>
+                <w:rtl/>
+                <w:lang w:val="fa-IR" w:bidi="fa-IR"/>
               </w:rPr>
               <w:t xml:space="preserve"> اعمال نشده است</w:t>
             </w:r>
@@ -664,28 +643,25 @@
       <w:tr>
         <w:trPr>
           <w:cantSplit/>
+          <w:jc w:val="center"/>
         </w:trPr>
         <w:tc>
           <w:tcPr>
-            <w:tcW w:type="dxa" w:w="2041"/>
+            <w:tcW w:w="2041" w:type="dxa"/>
+            <w:shd w:val="clear" w:color="auto" w:fill="FFFFFF"/>
             <w:vAlign w:val="center"/>
-            <w:shd w:fill="FFFFFF"/>
           </w:tcPr>
           <w:p>
             <w:pPr>
-              <w:spacing w:after="0" w:before="0" w:line="274" w:lineRule="auto"/>
-              <w:jc w:val="start"/>
-              <w:bidi w:val="1"/>
+              <w:bidi/>
+              <w:spacing w:after="0" w:line="274" w:lineRule="auto"/>
             </w:pPr>
             <w:r>
               <w:rPr>
-                <w:rFonts w:ascii="Tahoma" w:hAnsi="Tahoma" w:eastAsia="Tahoma" w:cs="Tahoma"/>
-                <w:b w:val="0"/>
-                <w:color w:val="000000"/>
-                <w:sz w:val="18"/>
-                <w:szCs w:val="18"/>
-                <w:lang w:val="fa-IR" w:bidi="fa-IR"/>
-                <w:rtl w:val="1"/>
+                <w:sz w:val="18"/>
+                <w:szCs w:val="18"/>
+                <w:rtl/>
+                <w:lang w:val="fa-IR" w:bidi="fa-IR"/>
               </w:rPr>
               <w:t>شمارش فعلی</w:t>
             </w:r>
@@ -693,25 +669,21 @@
         </w:tc>
         <w:tc>
           <w:tcPr>
-            <w:tcW w:type="dxa" w:w="7824"/>
+            <w:tcW w:w="7824" w:type="dxa"/>
+            <w:shd w:val="clear" w:color="auto" w:fill="FFFFFF"/>
             <w:vAlign w:val="center"/>
-            <w:shd w:fill="FFFFFF"/>
           </w:tcPr>
           <w:p>
             <w:pPr>
-              <w:spacing w:after="0" w:before="0" w:line="274" w:lineRule="auto"/>
-              <w:jc w:val="start"/>
-              <w:bidi w:val="1"/>
+              <w:bidi/>
+              <w:spacing w:after="0" w:line="274" w:lineRule="auto"/>
             </w:pPr>
             <w:r>
               <w:rPr>
-                <w:rFonts w:ascii="Tahoma" w:hAnsi="Tahoma" w:eastAsia="Tahoma" w:cs="Tahoma"/>
-                <w:b w:val="0"/>
-                <w:color w:val="000000"/>
-                <w:sz w:val="18"/>
-                <w:szCs w:val="18"/>
-                <w:lang w:val="fa-IR" w:bidi="fa-IR"/>
-                <w:rtl w:val="1"/>
+                <w:sz w:val="18"/>
+                <w:szCs w:val="18"/>
+                <w:rtl/>
+                <w:lang w:val="fa-IR" w:bidi="fa-IR"/>
               </w:rPr>
               <w:t>۱٬۰۱۷٬۶۳۵ پرونده منطبق؛ بیشتر از حداقل ۳۰۰٬۰۰۰ رکورد چالش</w:t>
             </w:r>
@@ -722,230 +694,292 @@
     <w:p>
       <w:pPr>
         <w:keepNext/>
-        <w:spacing w:after="0" w:before="0" w:line="72" w:lineRule="auto"/>
+        <w:spacing w:after="0" w:line="72" w:lineRule="auto"/>
       </w:pPr>
     </w:p>
     <w:p>
       <w:pPr>
         <w:pStyle w:val="Heading2"/>
-        <w:spacing w:after="100" w:before="80" w:line="293" w:lineRule="auto"/>
-        <w:jc w:val="start"/>
-        <w:keepNext/>
-        <w:bidi w:val="1"/>
-      </w:pPr>
-      <w:r>
-        <w:rPr>
-          <w:rFonts w:ascii="Tahoma" w:hAnsi="Tahoma" w:eastAsia="Tahoma" w:cs="Tahoma"/>
+        <w:bidi/>
+        <w:spacing w:before="80" w:after="100" w:line="293" w:lineRule="auto"/>
+      </w:pPr>
+      <w:r>
+        <w:rPr>
+          <w:rFonts w:ascii="Tahoma" w:eastAsia="Tahoma" w:hAnsi="Tahoma" w:cs="Tahoma"/>
           <w:b/>
-          <w:color w:val="000000"/>
+          <w:bCs/>
           <w:sz w:val="23"/>
           <w:szCs w:val="23"/>
+          <w:rtl/>
           <w:lang w:val="fa-IR" w:bidi="fa-IR"/>
-          <w:rtl w:val="1"/>
-          <w:bCs w:val="1"/>
         </w:rPr>
         <w:t>دلیل انتخاب و پیامد آن</w:t>
       </w:r>
     </w:p>
     <w:p>
       <w:pPr>
-        <w:spacing w:after="120" w:before="0" w:line="293" w:lineRule="auto"/>
-        <w:jc w:val="start"/>
-        <w:bidi w:val="1"/>
-      </w:pPr>
-      <w:r>
-        <w:rPr>
-          <w:rFonts w:ascii="Tahoma" w:hAnsi="Tahoma" w:eastAsia="Tahoma" w:cs="Tahoma"/>
-          <w:b w:val="0"/>
-          <w:color w:val="000000"/>
-          <w:sz w:val="21"/>
-          <w:szCs w:val="21"/>
+        <w:bidi/>
+        <w:spacing w:after="120" w:line="293" w:lineRule="auto"/>
+        <w:rPr>
+          <w:rFonts w:hint="cs"/>
+          <w:rtl/>
+        </w:rPr>
+      </w:pPr>
+      <w:r>
+        <w:rPr>
+          <w:szCs w:val="21"/>
+          <w:rtl/>
           <w:lang w:val="fa-IR" w:bidi="fa-IR"/>
-          <w:rtl w:val="1"/>
-        </w:rPr>
-        <w:t>محدودسازی موضوعی، مسئله را روی پنج محیط مشخص سر‌وصدا متمرکز می‌کند و در عین حال تنوع نوع شکایت را برای جدول ماهانه حفظ می‌کند. برداشتن فیلتر بروکلین نیز امکان مقایسه مناطق و نرخ درخواست نسبت به جمعیت را فراهم می‌کند. انتخاب بازه ثابت ۱۸ماهه، ماه‌های پیوسته را پوشش می‌دهد و دامنه اجرای مجدد را روشن نگه می‌دارد.</w:t>
+        </w:rPr>
+        <w:t xml:space="preserve">محدودسازی موضوعی، مسئله را روی پنج محیط مشخص سر‌وصدا متمرکز می‌کند و در عین حال تنوع نوع شکایت را برای جدول ماهانه حفظ می‌کند. </w:t>
+      </w:r>
+      <w:r>
+        <w:rPr>
+          <w:rFonts w:hint="cs"/>
+          <w:szCs w:val="21"/>
+          <w:rtl/>
+          <w:lang w:val="fa-IR" w:bidi="fa-IR"/>
+        </w:rPr>
+        <w:t xml:space="preserve">در ابتدا تنها نوع فیلتر را روی منطقه مکانی </w:t>
+      </w:r>
+      <w:r>
+        <w:rPr>
+          <w:szCs w:val="21"/>
+          <w:lang w:bidi="fa-IR"/>
+        </w:rPr>
+        <w:t>BROOKLYN</w:t>
+      </w:r>
+      <w:r>
+        <w:rPr>
+          <w:rFonts w:hint="cs"/>
+          <w:szCs w:val="21"/>
+          <w:rtl/>
+          <w:lang w:bidi="fa-IR"/>
+        </w:rPr>
+        <w:t xml:space="preserve"> قرار دادم ولی یک عیبی که داشت این بود که دیگه مقای</w:t>
+      </w:r>
+      <w:r>
+        <w:rPr>
+          <w:rFonts w:hint="cs"/>
+          <w:szCs w:val="21"/>
+          <w:rtl/>
+          <w:lang w:bidi="fa-IR"/>
+        </w:rPr>
+        <w:t>س</w:t>
+      </w:r>
+      <w:r>
+        <w:rPr>
+          <w:rFonts w:hint="cs"/>
+          <w:szCs w:val="21"/>
+          <w:rtl/>
+          <w:lang w:bidi="fa-IR"/>
+        </w:rPr>
+        <w:t xml:space="preserve">ه منطقه مکانی در جاهای مختلف نیویورک قایل مقایسه نبود و یا برای اساس نوع </w:t>
+      </w:r>
+      <w:r>
+        <w:rPr>
+          <w:szCs w:val="21"/>
+          <w:lang w:bidi="fa-IR"/>
+        </w:rPr>
+        <w:t xml:space="preserve">agency </w:t>
+      </w:r>
+      <w:r>
+        <w:rPr>
+          <w:rFonts w:hint="cs"/>
+          <w:szCs w:val="21"/>
+          <w:rtl/>
+          <w:lang w:bidi="fa-IR"/>
+        </w:rPr>
+        <w:t xml:space="preserve"> جدا کردم که چون هر </w:t>
+      </w:r>
+      <w:r>
+        <w:rPr>
+          <w:szCs w:val="21"/>
+          <w:lang w:bidi="fa-IR"/>
+        </w:rPr>
+        <w:t xml:space="preserve">agency </w:t>
+      </w:r>
+      <w:r>
+        <w:rPr>
+          <w:rFonts w:hint="cs"/>
+          <w:szCs w:val="21"/>
+          <w:rtl/>
+          <w:lang w:bidi="fa-IR"/>
+        </w:rPr>
+        <w:t xml:space="preserve"> یک نوع سازمان برای رسیدگی به یک نوع شکایات محدود هست لذا این مانند پرداختن به یک نوع خاصی از شکایات هست که البته الان هم تنها نوع خاص شکایات مربوط به سروصدا ملاک قرار میگیرد که همانطور که پیداست </w:t>
+      </w:r>
+      <w:r>
+        <w:rPr>
+          <w:szCs w:val="21"/>
+          <w:lang w:bidi="fa-IR"/>
+        </w:rPr>
+        <w:t xml:space="preserve">agency </w:t>
+      </w:r>
+      <w:r>
+        <w:rPr>
+          <w:rFonts w:hint="cs"/>
+          <w:szCs w:val="21"/>
+          <w:rtl/>
+          <w:lang w:bidi="fa-IR"/>
+        </w:rPr>
+        <w:t xml:space="preserve"> انها تا جایی که من الان دارم مشاهده میکنم یکیع. پس این یک تصمیم هست که شاید در چالش های بعدی برای پاسخ به سوال اصلی تغییر کنه!</w:t>
       </w:r>
     </w:p>
     <w:p>
       <w:pPr>
-        <w:spacing w:after="120" w:before="0" w:line="293" w:lineRule="auto"/>
-        <w:jc w:val="start"/>
-        <w:bidi w:val="1"/>
-      </w:pPr>
-      <w:r>
-        <w:rPr>
-          <w:rFonts w:ascii="Tahoma" w:hAnsi="Tahoma" w:eastAsia="Tahoma" w:cs="Tahoma"/>
-          <w:b w:val="0"/>
-          <w:color w:val="000000"/>
-          <w:sz w:val="21"/>
-          <w:szCs w:val="21"/>
+        <w:bidi/>
+        <w:spacing w:after="120" w:line="293" w:lineRule="auto"/>
+        <w:rPr>
+          <w:szCs w:val="21"/>
+          <w:rtl/>
           <w:lang w:val="fa-IR" w:bidi="fa-IR"/>
-          <w:rtl w:val="1"/>
+        </w:rPr>
+      </w:pPr>
+      <w:r>
+        <w:rPr>
+          <w:rFonts w:hint="cs"/>
+          <w:szCs w:val="21"/>
+          <w:rtl/>
+          <w:lang w:val="fa-IR" w:bidi="fa-IR"/>
+        </w:rPr>
+        <w:t xml:space="preserve">ولی بازم </w:t>
+      </w:r>
+      <w:r>
+        <w:rPr>
+          <w:szCs w:val="21"/>
+          <w:rtl/>
+          <w:lang w:val="fa-IR" w:bidi="fa-IR"/>
         </w:rPr>
         <w:t xml:space="preserve">این انتخاب شامل همه گروه‌های سر‌وصدا نیست؛ دسته عمومی </w:t>
       </w:r>
       <w:r>
         <w:rPr>
-          <w:rFonts w:ascii="Tahoma" w:hAnsi="Tahoma" w:eastAsia="Tahoma" w:cs="Tahoma"/>
-          <w:b w:val="0"/>
-          <w:color w:val="000000"/>
-          <w:sz w:val="21"/>
           <w:szCs w:val="21"/>
           <w:lang w:val="fa-IR" w:bidi="fa-IR"/>
-          <w:rtl w:val="0"/>
         </w:rPr>
         <w:t>Noise</w:t>
       </w:r>
       <w:r>
         <w:rPr>
-          <w:rFonts w:ascii="Tahoma" w:hAnsi="Tahoma" w:eastAsia="Tahoma" w:cs="Tahoma"/>
-          <w:b w:val="0"/>
-          <w:color w:val="000000"/>
-          <w:sz w:val="21"/>
-          <w:szCs w:val="21"/>
+          <w:szCs w:val="21"/>
+          <w:rtl/>
           <w:lang w:val="fa-IR" w:bidi="fa-IR"/>
-          <w:rtl w:val="1"/>
         </w:rPr>
         <w:t>، شکایت‌های بالگرد و اماکن مذهبی خارج از دامنه‌اند. بنابراین نتایج به همین پنج گروه تعمیم دارند. پرونده‌های باز از ابتدا کنار گذاشته نشده‌اند تا انتخاب داده به نتیجه رسیدگی وابسته نشود. حداقل ۳۰۰ هزار، شرط کف حجم است؛ دامنه دریافت با فیلتر تعریف می‌شود و در رکورد سیصدهزارم قطع نمی‌شود.</w:t>
       </w:r>
     </w:p>
     <w:p>
       <w:pPr>
+        <w:bidi/>
+        <w:spacing w:after="120" w:line="293" w:lineRule="auto"/>
+        <w:rPr>
+          <w:rFonts w:hint="cs"/>
+          <w:rtl/>
+        </w:rPr>
+      </w:pPr>
+      <w:r>
+        <w:rPr>
+          <w:rFonts w:hint="cs"/>
+          <w:szCs w:val="21"/>
+          <w:rtl/>
+          <w:lang w:val="fa-IR" w:bidi="fa-IR"/>
+        </w:rPr>
+        <w:t xml:space="preserve">خلاصه هر نوع انتخاب برای محدود سازی یک عیبی میتونست در انتها ایجاد کنه و ما باید بر اساس هدف نهاییمون از </w:t>
+      </w:r>
+      <w:r>
+        <w:rPr>
+          <w:szCs w:val="21"/>
+          <w:lang w:bidi="fa-IR"/>
+        </w:rPr>
+        <w:t xml:space="preserve">data gathering </w:t>
+      </w:r>
+      <w:r>
+        <w:rPr>
+          <w:rFonts w:hint="cs"/>
+          <w:szCs w:val="21"/>
+          <w:rtl/>
+          <w:lang w:bidi="fa-IR"/>
+        </w:rPr>
+        <w:t xml:space="preserve"> انتخابی داشته باشیم که کمترین محدودیت رو برای تحلیل هامون ایجاد کنه.</w:t>
+      </w:r>
+    </w:p>
+    <w:p>
+      <w:pPr>
         <w:pStyle w:val="Heading2"/>
-        <w:spacing w:after="100" w:before="80" w:line="293" w:lineRule="auto"/>
-        <w:jc w:val="start"/>
-        <w:keepNext/>
-        <w:bidi w:val="1"/>
-      </w:pPr>
-      <w:r>
-        <w:rPr>
-          <w:rFonts w:ascii="Tahoma" w:hAnsi="Tahoma" w:eastAsia="Tahoma" w:cs="Tahoma"/>
+        <w:bidi/>
+        <w:spacing w:before="80" w:after="100" w:line="293" w:lineRule="auto"/>
+      </w:pPr>
+      <w:r>
+        <w:rPr>
+          <w:rFonts w:ascii="Tahoma" w:eastAsia="Tahoma" w:hAnsi="Tahoma" w:cs="Tahoma"/>
           <w:b/>
-          <w:color w:val="000000"/>
+          <w:bCs/>
           <w:sz w:val="23"/>
           <w:szCs w:val="23"/>
+          <w:rtl/>
           <w:lang w:val="fa-IR" w:bidi="fa-IR"/>
-          <w:rtl w:val="1"/>
-          <w:bCs w:val="1"/>
-        </w:rPr>
-        <w:t>شاهد و وضعیت کار</w:t>
+        </w:rPr>
+        <w:t>استفاده از دستیار هوش مصنوعی</w:t>
       </w:r>
     </w:p>
     <w:p>
       <w:pPr>
-        <w:spacing w:after="120" w:before="0" w:line="293" w:lineRule="auto"/>
-        <w:jc w:val="start"/>
-        <w:bidi w:val="1"/>
-      </w:pPr>
-      <w:r>
-        <w:rPr>
-          <w:rFonts w:ascii="Tahoma" w:hAnsi="Tahoma" w:eastAsia="Tahoma" w:cs="Tahoma"/>
-          <w:b w:val="0"/>
-          <w:color w:val="000000"/>
-          <w:sz w:val="19"/>
-          <w:szCs w:val="19"/>
+        <w:bidi/>
+        <w:spacing w:after="120" w:line="293" w:lineRule="auto"/>
+        <w:rPr>
+          <w:sz w:val="18"/>
+          <w:szCs w:val="18"/>
+          <w:rtl/>
           <w:lang w:val="fa-IR" w:bidi="fa-IR"/>
-          <w:rtl w:val="1"/>
-        </w:rPr>
-        <w:t xml:space="preserve">مقادیر دامنه در </w:t>
-      </w:r>
-      <w:r>
-        <w:rPr>
-          <w:rFonts w:ascii="Tahoma" w:hAnsi="Tahoma" w:eastAsia="Tahoma" w:cs="Tahoma"/>
-          <w:b w:val="0"/>
-          <w:color w:val="000000"/>
-          <w:sz w:val="19"/>
-          <w:szCs w:val="19"/>
+        </w:rPr>
+      </w:pPr>
+      <w:r>
+        <w:rPr>
+          <w:sz w:val="18"/>
+          <w:szCs w:val="18"/>
+          <w:rtl/>
           <w:lang w:val="fa-IR" w:bidi="fa-IR"/>
-          <w:rtl w:val="0"/>
-        </w:rPr>
-        <w:t>config/setting.json</w:t>
-      </w:r>
-      <w:r>
-        <w:rPr>
-          <w:rFonts w:ascii="Tahoma" w:hAnsi="Tahoma" w:eastAsia="Tahoma" w:cs="Tahoma"/>
-          <w:b w:val="0"/>
-          <w:color w:val="000000"/>
-          <w:sz w:val="19"/>
-          <w:szCs w:val="19"/>
+        </w:rPr>
+        <w:t>برای بررسی گزینه‌های محدودسازی و تنظیم یادداشت شناخت داده و خلاصه تصمیم‌ها از دستیار هوش مصنوعی کمک گرفت</w:t>
+      </w:r>
+      <w:r>
+        <w:rPr>
+          <w:rFonts w:hint="cs"/>
+          <w:sz w:val="18"/>
+          <w:szCs w:val="18"/>
+          <w:rtl/>
           <w:lang w:val="fa-IR" w:bidi="fa-IR"/>
-          <w:rtl w:val="1"/>
-        </w:rPr>
-        <w:t xml:space="preserve"> ثبت شده‌اند و عدد ۱٬۰۱۷٬۶۳۵ از خروجی سلول شمارش فیلتر جدید در </w:t>
-      </w:r>
-      <w:r>
-        <w:rPr>
-          <w:rFonts w:ascii="Tahoma" w:hAnsi="Tahoma" w:eastAsia="Tahoma" w:cs="Tahoma"/>
-          <w:b w:val="0"/>
-          <w:color w:val="000000"/>
-          <w:sz w:val="19"/>
-          <w:szCs w:val="19"/>
-          <w:lang w:val="fa-IR" w:bidi="fa-IR"/>
-          <w:rtl w:val="0"/>
-        </w:rPr>
-        <w:t>challenge_solution.ipynb</w:t>
-      </w:r>
-      <w:r>
-        <w:rPr>
-          <w:rFonts w:ascii="Tahoma" w:hAnsi="Tahoma" w:eastAsia="Tahoma" w:cs="Tahoma"/>
-          <w:b w:val="0"/>
-          <w:color w:val="000000"/>
-          <w:sz w:val="19"/>
-          <w:szCs w:val="19"/>
-          <w:lang w:val="fa-IR" w:bidi="fa-IR"/>
-          <w:rtl w:val="1"/>
-        </w:rPr>
-        <w:t xml:space="preserve"> گرفته شده است. این عدد شمارش منبع است؛ تعداد پرونده‌های معتبر، تکراری یا قرنطینه‌شده پس از پردازش مشخص می‌شود. جزئیات منبع و ویژگی‌ها در یادداشت مستقل شناخت داده نگهداری می‌شود.</w:t>
+        </w:rPr>
+        <w:t>م.</w:t>
       </w:r>
     </w:p>
     <w:p>
       <w:pPr>
-        <w:pStyle w:val="Heading2"/>
-        <w:spacing w:after="100" w:before="80" w:line="293" w:lineRule="auto"/>
-        <w:jc w:val="start"/>
-        <w:keepNext/>
-        <w:bidi w:val="1"/>
-      </w:pPr>
-      <w:r>
-        <w:rPr>
-          <w:rFonts w:ascii="Tahoma" w:hAnsi="Tahoma" w:eastAsia="Tahoma" w:cs="Tahoma"/>
-          <w:b/>
-          <w:color w:val="000000"/>
-          <w:sz w:val="23"/>
-          <w:szCs w:val="23"/>
-          <w:lang w:val="fa-IR" w:bidi="fa-IR"/>
-          <w:rtl w:val="1"/>
-          <w:bCs w:val="1"/>
-        </w:rPr>
-        <w:t>استفاده از دستیار هوش مصنوعی</w:t>
-      </w:r>
-    </w:p>
-    <w:p>
-      <w:pPr>
-        <w:spacing w:after="120" w:before="0" w:line="293" w:lineRule="auto"/>
-        <w:jc w:val="start"/>
-        <w:bidi w:val="1"/>
-      </w:pPr>
-      <w:r>
-        <w:rPr>
-          <w:rFonts w:ascii="Tahoma" w:hAnsi="Tahoma" w:eastAsia="Tahoma" w:cs="Tahoma"/>
-          <w:b w:val="0"/>
-          <w:color w:val="000000"/>
-          <w:sz w:val="18"/>
-          <w:szCs w:val="18"/>
-          <w:lang w:val="fa-IR" w:bidi="fa-IR"/>
-          <w:rtl w:val="1"/>
-        </w:rPr>
-        <w:t>برای بررسی گزینه‌های محدودسازی و تنظیم یادداشت شناخت داده و خلاصه تصمیم‌ها از دستیار هوش مصنوعی کمک گرفته شده است.</w:t>
+        <w:bidi/>
+        <w:spacing w:after="120" w:line="293" w:lineRule="auto"/>
+        <w:ind w:left="360"/>
+        <w:rPr>
+          <w:rFonts w:hint="cs"/>
+          <w:rtl/>
+          <w:lang w:bidi="fa-IR"/>
+        </w:rPr>
+      </w:pPr>
+      <w:r>
+        <w:rPr>
+          <w:rFonts w:hint="cs"/>
+          <w:rtl/>
+          <w:lang w:bidi="fa-IR"/>
+        </w:rPr>
+        <w:t xml:space="preserve"> </w:t>
       </w:r>
     </w:p>
     <w:sectPr>
-      <w:headerReference w:type="even" r:id="rId6"/>
-      <w:headerReference w:type="default" r:id="rId7"/>
-      <w:footerReference w:type="even" r:id="rId8"/>
-      <w:footerReference w:type="default" r:id="rId9"/>
-      <w:headerReference w:type="first" r:id="rId10"/>
-      <w:footerReference w:type="first" r:id="rId11"/>
+      <w:headerReference w:type="even" r:id="rId8"/>
+      <w:headerReference w:type="default" r:id="rId9"/>
+      <w:footerReference w:type="even" r:id="rId10"/>
+      <w:footerReference w:type="default" r:id="rId11"/>
+      <w:headerReference w:type="first" r:id="rId12"/>
+      <w:footerReference w:type="first" r:id="rId13"/>
       <w:pgSz w:w="11906" w:h="16838"/>
       <w:pgMar w:top="879" w:right="1020" w:bottom="879" w:left="1020" w:header="397" w:footer="397" w:gutter="0"/>
       <w:cols w:space="720"/>
@@ -1068,6 +1102,127 @@
     </w:pPr>
   </w:p>
 </w:hdr>
+</file>
+
+<file path=word/numbering.xml><?xml version="1.0" encoding="utf-8"?>
+<w:numbering xmlns:wpc="http://schemas.microsoft.com/office/word/2010/wordprocessingCanvas" xmlns:cx="http://schemas.microsoft.com/office/drawing/2014/chartex" xmlns:cx1="http://schemas.microsoft.com/office/drawing/2015/9/8/chartex" xmlns:cx2="http://schemas.microsoft.com/office/drawing/2015/10/21/chartex" xmlns:cx3="http://schemas.microsoft.com/office/drawing/2016/5/9/chartex" xmlns:cx4="http://schemas.microsoft.com/office/drawing/2016/5/10/chartex" xmlns:cx5="http://schemas.microsoft.com/office/drawing/2016/5/11/chartex" xmlns:cx6="http://schemas.microsoft.com/office/drawing/2016/5/12/chartex" xmlns:cx7="http://schemas.microsoft.com/office/drawing/2016/5/13/chartex" xmlns:cx8="http://schemas.microsoft.com/office/drawing/2016/5/14/chartex" xmlns:mc="http://schemas.openxmlformats.org/markup-compatibility/2006" xmlns:aink="http://schemas.microsoft.com/office/drawing/2016/ink" xmlns:am3d="http://schemas.microsoft.com/office/drawing/2017/model3d" xmlns:o="urn:schemas-microsoft-com:office:office" xmlns:oel="http://schemas.microsoft.com/office/2019/extlst" xmlns:r="http://schemas.openxmlformats.org/officeDocument/2006/relationships" xmlns:m="http://schemas.openxmlformats.org/officeDocument/2006/math" xmlns:v="urn:schemas-microsoft-com:vml" xmlns:wp14="http://schemas.microsoft.com/office/word/2010/wordprocessingDrawing" xmlns:wp="http://schemas.openxmlformats.org/drawingml/2006/wordprocessingDrawing" xmlns:w10="urn:schemas-microsoft-com:office:word" xmlns:w="http://schemas.openxmlformats.org/wordprocessingml/2006/main" xmlns:w14="http://schemas.microsoft.com/office/word/2010/wordml" xmlns:w15="http://schemas.microsoft.com/office/word/2012/wordml" xmlns:w16cex="http://schemas.microsoft.com/office/word/2018/wordml/cex" xmlns:w16cid="http://schemas.microsoft.com/office/word/2016/wordml/cid" xmlns:w16="http://schemas.microsoft.com/office/word/2018/wordml" xmlns:w16du="http://schemas.microsoft.com/office/word/2023/wordml/word16du" xmlns:w16sdtdh="http://schemas.microsoft.com/office/word/2020/wordml/sdtdatahash" xmlns:w16sdtfl="http://schemas.microsoft.com/office/word/2024/wordml/sdtformatlock" xmlns:w16se="http://schemas.microsoft.com/office/word/2015/wordml/symex" xmlns:wpg="http://schemas.microsoft.com/office/word/2010/wordprocessingGroup" xmlns:wpi="http://schemas.microsoft.com/office/word/2010/wordprocessingInk" xmlns:wne="http://schemas.microsoft.com/office/word/2006/wordml" xmlns:wps="http://schemas.microsoft.com/office/word/2010/wordprocessingShape" mc:Ignorable="w14 w15 w16se w16cid w16 w16cex w16sdtdh w16sdtfl w16du wp14">
+  <w:abstractNum w:abstractNumId="0" w15:restartNumberingAfterBreak="0">
+    <w:nsid w:val="787901E6"/>
+    <w:multiLevelType w:val="hybridMultilevel"/>
+    <w:tmpl w:val="EE98DD18"/>
+    <w:lvl w:ilvl="0" w:tplc="04090001">
+      <w:start w:val="1"/>
+      <w:numFmt w:val="bullet"/>
+      <w:lvlText w:val=""/>
+      <w:lvlJc w:val="left"/>
+      <w:pPr>
+        <w:ind w:left="720" w:hanging="360"/>
+      </w:pPr>
+      <w:rPr>
+        <w:rFonts w:ascii="Symbol" w:hAnsi="Symbol" w:hint="default"/>
+      </w:rPr>
+    </w:lvl>
+    <w:lvl w:ilvl="1" w:tplc="04090003" w:tentative="1">
+      <w:start w:val="1"/>
+      <w:numFmt w:val="bullet"/>
+      <w:lvlText w:val="o"/>
+      <w:lvlJc w:val="left"/>
+      <w:pPr>
+        <w:ind w:left="1440" w:hanging="360"/>
+      </w:pPr>
+      <w:rPr>
+        <w:rFonts w:ascii="Courier New" w:hAnsi="Courier New" w:cs="Courier New" w:hint="default"/>
+      </w:rPr>
+    </w:lvl>
+    <w:lvl w:ilvl="2" w:tplc="04090005" w:tentative="1">
+      <w:start w:val="1"/>
+      <w:numFmt w:val="bullet"/>
+      <w:lvlText w:val=""/>
+      <w:lvlJc w:val="left"/>
+      <w:pPr>
+        <w:ind w:left="2160" w:hanging="360"/>
+      </w:pPr>
+      <w:rPr>
+        <w:rFonts w:ascii="Wingdings" w:hAnsi="Wingdings" w:hint="default"/>
+      </w:rPr>
+    </w:lvl>
+    <w:lvl w:ilvl="3" w:tplc="04090001" w:tentative="1">
+      <w:start w:val="1"/>
+      <w:numFmt w:val="bullet"/>
+      <w:lvlText w:val=""/>
+      <w:lvlJc w:val="left"/>
+      <w:pPr>
+        <w:ind w:left="2880" w:hanging="360"/>
+      </w:pPr>
+      <w:rPr>
+        <w:rFonts w:ascii="Symbol" w:hAnsi="Symbol" w:hint="default"/>
+      </w:rPr>
+    </w:lvl>
+    <w:lvl w:ilvl="4" w:tplc="04090003" w:tentative="1">
+      <w:start w:val="1"/>
+      <w:numFmt w:val="bullet"/>
+      <w:lvlText w:val="o"/>
+      <w:lvlJc w:val="left"/>
+      <w:pPr>
+        <w:ind w:left="3600" w:hanging="360"/>
+      </w:pPr>
+      <w:rPr>
+        <w:rFonts w:ascii="Courier New" w:hAnsi="Courier New" w:cs="Courier New" w:hint="default"/>
+      </w:rPr>
+    </w:lvl>
+    <w:lvl w:ilvl="5" w:tplc="04090005" w:tentative="1">
+      <w:start w:val="1"/>
+      <w:numFmt w:val="bullet"/>
+      <w:lvlText w:val=""/>
+      <w:lvlJc w:val="left"/>
+      <w:pPr>
+        <w:ind w:left="4320" w:hanging="360"/>
+      </w:pPr>
+      <w:rPr>
+        <w:rFonts w:ascii="Wingdings" w:hAnsi="Wingdings" w:hint="default"/>
+      </w:rPr>
+    </w:lvl>
+    <w:lvl w:ilvl="6" w:tplc="04090001" w:tentative="1">
+      <w:start w:val="1"/>
+      <w:numFmt w:val="bullet"/>
+      <w:lvlText w:val=""/>
+      <w:lvlJc w:val="left"/>
+      <w:pPr>
+        <w:ind w:left="5040" w:hanging="360"/>
+      </w:pPr>
+      <w:rPr>
+        <w:rFonts w:ascii="Symbol" w:hAnsi="Symbol" w:hint="default"/>
+      </w:rPr>
+    </w:lvl>
+    <w:lvl w:ilvl="7" w:tplc="04090003" w:tentative="1">
+      <w:start w:val="1"/>
+      <w:numFmt w:val="bullet"/>
+      <w:lvlText w:val="o"/>
+      <w:lvlJc w:val="left"/>
+      <w:pPr>
+        <w:ind w:left="5760" w:hanging="360"/>
+      </w:pPr>
+      <w:rPr>
+        <w:rFonts w:ascii="Courier New" w:hAnsi="Courier New" w:cs="Courier New" w:hint="default"/>
+      </w:rPr>
+    </w:lvl>
+    <w:lvl w:ilvl="8" w:tplc="04090005" w:tentative="1">
+      <w:start w:val="1"/>
+      <w:numFmt w:val="bullet"/>
+      <w:lvlText w:val=""/>
+      <w:lvlJc w:val="left"/>
+      <w:pPr>
+        <w:ind w:left="6480" w:hanging="360"/>
+      </w:pPr>
+      <w:rPr>
+        <w:rFonts w:ascii="Wingdings" w:hAnsi="Wingdings" w:hint="default"/>
+      </w:rPr>
+    </w:lvl>
+  </w:abstractNum>
+  <w:num w:numId="1" w16cid:durableId="1051228931">
+    <w:abstractNumId w:val="0"/>
+  </w:num>
+</w:numbering>
 </file>
 
 <file path=word/styles.xml><?xml version="1.0" encoding="utf-8"?>
@@ -1471,9 +1626,8 @@
     <w:name w:val="Normal"/>
     <w:qFormat/>
     <w:rsid w:val="00B3074A"/>
-    <w:pPr/>
-    <w:rPr>
-      <w:rFonts w:ascii="Tahoma" w:hAnsi="Tahoma" w:cs="Tahoma" w:eastAsia="Tahoma"/>
+    <w:rPr>
+      <w:rFonts w:ascii="Tahoma" w:eastAsia="Tahoma" w:hAnsi="Tahoma" w:cs="Tahoma"/>
       <w:color w:val="000000"/>
       <w:sz w:val="21"/>
     </w:rPr>
@@ -1493,9 +1647,7 @@
       <w:outlineLvl w:val="0"/>
     </w:pPr>
     <w:rPr>
-      <w:rFonts w:asciiTheme="majorHAnsi" w:eastAsiaTheme="majorEastAsia" w:hAnsiTheme="majorHAnsi" w:cstheme="majorBidi" w:ascii="Tahoma" w:hAnsi="Tahoma" w:cs="Tahoma" w:eastAsia="Tahoma"/>
-      <w:color w:val="000000"/>
-      <w:sz w:val="21"/>
+      <w:rFonts w:asciiTheme="majorHAnsi" w:eastAsiaTheme="majorEastAsia" w:hAnsiTheme="majorHAnsi" w:cstheme="majorBidi"/>
       <w:szCs w:val="40"/>
     </w:rPr>
   </w:style>
@@ -1516,9 +1668,7 @@
       <w:outlineLvl w:val="1"/>
     </w:pPr>
     <w:rPr>
-      <w:rFonts w:asciiTheme="majorHAnsi" w:eastAsiaTheme="majorEastAsia" w:hAnsiTheme="majorHAnsi" w:cstheme="majorBidi" w:ascii="Tahoma" w:hAnsi="Tahoma" w:cs="Tahoma" w:eastAsia="Tahoma"/>
-      <w:color w:val="000000"/>
-      <w:sz w:val="21"/>
+      <w:rFonts w:asciiTheme="majorHAnsi" w:eastAsiaTheme="majorEastAsia" w:hAnsiTheme="majorHAnsi" w:cstheme="majorBidi"/>
       <w:szCs w:val="32"/>
     </w:rPr>
   </w:style>
@@ -1680,7 +1830,6 @@
   <w:style w:type="character" w:default="1" w:styleId="DefaultParagraphFont">
     <w:name w:val="Default Paragraph Font"/>
     <w:uiPriority w:val="1"/>
-    <w:semiHidden/>
     <w:unhideWhenUsed/>
   </w:style>
   <w:style w:type="table" w:default="1" w:styleId="TableNormal">
@@ -1836,11 +1985,9 @@
       <w:contextualSpacing/>
     </w:pPr>
     <w:rPr>
-      <w:rFonts w:asciiTheme="majorHAnsi" w:eastAsiaTheme="majorEastAsia" w:hAnsiTheme="majorHAnsi" w:cstheme="majorBidi" w:ascii="Tahoma" w:hAnsi="Tahoma" w:cs="Tahoma" w:eastAsia="Tahoma"/>
-      <w:color w:val="000000"/>
+      <w:rFonts w:asciiTheme="majorHAnsi" w:eastAsiaTheme="majorEastAsia" w:hAnsiTheme="majorHAnsi" w:cstheme="majorBidi"/>
       <w:spacing w:val="-10"/>
       <w:kern w:val="28"/>
-      <w:sz w:val="21"/>
       <w:szCs w:val="56"/>
     </w:rPr>
   </w:style>
@@ -2361,4 +2508,16 @@
     </a:ext>
   </a:extLst>
 </a:theme>
+</file>
+
+<file path=customXml/item1.xml><?xml version="1.0" encoding="utf-8"?>
+<b:Sources xmlns:b="http://schemas.openxmlformats.org/officeDocument/2006/bibliography" xmlns="http://schemas.openxmlformats.org/officeDocument/2006/bibliography" SelectedStyle="\APASixthEditionOfficeOnline.xsl" StyleName="APA" Version="6"/>
+</file>
+
+<file path=customXml/itemProps1.xml><?xml version="1.0" encoding="utf-8"?>
+<ds:datastoreItem xmlns:ds="http://schemas.openxmlformats.org/officeDocument/2006/customXml" ds:itemID="{FEE727AC-F13E-450D-9358-58A006ED39AF}">
+  <ds:schemaRefs>
+    <ds:schemaRef ds:uri="http://schemas.openxmlformats.org/officeDocument/2006/bibliography"/>
+  </ds:schemaRefs>
+</ds:datastoreItem>
 </file>
</xml_diff>

<commit_message>
final delivery result are added.
</commit_message>
<xml_diff>
--- a/report.docx
+++ b/report.docx
@@ -5,972 +5,1528 @@
     <w:p>
       <w:pPr>
         <w:pStyle w:val="Title"/>
-        <w:bidi/>
-        <w:spacing w:after="140" w:line="293" w:lineRule="auto"/>
-      </w:pPr>
-      <w:r>
-        <w:rPr>
-          <w:rFonts w:ascii="Tahoma" w:eastAsia="Tahoma" w:hAnsi="Tahoma" w:cs="Tahoma"/>
-          <w:b/>
-          <w:bCs/>
-          <w:sz w:val="30"/>
-          <w:szCs w:val="30"/>
-          <w:rtl/>
-          <w:lang w:val="fa-IR" w:bidi="fa-IR"/>
+        <w:spacing w:before="160"/>
+        <w:jc w:val="start"/>
+        <w:keepNext/>
+        <w:keepLines/>
+        <w:widowControl/>
+        <w:bidi w:val="1"/>
+      </w:pPr>
+      <w:r>
+        <w:rPr>
+          <w:rtl w:val="1"/>
+          <w:szCs w:val="26"/>
+          <w:bCs w:val="1"/>
         </w:rPr>
         <w:t>گزارش تصمیم‌های کارخانه داده درخواست‌های شهری</w:t>
       </w:r>
     </w:p>
     <w:p>
       <w:pPr>
-        <w:bidi/>
-        <w:spacing w:after="140" w:line="293" w:lineRule="auto"/>
-        <w:rPr>
-          <w:sz w:val="18"/>
-          <w:szCs w:val="18"/>
-          <w:rtl/>
-          <w:lang w:val="fa-IR" w:bidi="fa-IR"/>
-        </w:rPr>
-      </w:pPr>
-      <w:r>
-        <w:rPr>
-          <w:sz w:val="18"/>
-          <w:szCs w:val="18"/>
-          <w:rtl/>
-          <w:lang w:val="fa-IR" w:bidi="fa-IR"/>
-        </w:rPr>
-        <w:t>نویسنده احسان سویزی</w:t>
-      </w:r>
-    </w:p>
-    <w:p>
-      <w:pPr>
-        <w:bidi/>
-        <w:spacing w:after="140" w:line="293" w:lineRule="auto"/>
-        <w:rPr>
-          <w:sz w:val="18"/>
-          <w:szCs w:val="18"/>
-          <w:rtl/>
-          <w:lang w:val="fa-IR" w:bidi="fa-IR"/>
-        </w:rPr>
-      </w:pPr>
-    </w:p>
-    <w:p>
-      <w:pPr>
-        <w:bidi/>
-        <w:spacing w:after="140" w:line="293" w:lineRule="auto"/>
-        <w:rPr>
-          <w:rFonts w:hint="cs"/>
-          <w:sz w:val="24"/>
-          <w:rtl/>
-          <w:lang w:bidi="fa-IR"/>
-        </w:rPr>
-      </w:pPr>
-      <w:r>
-        <w:rPr>
-          <w:rFonts w:hint="cs"/>
-          <w:sz w:val="24"/>
-          <w:rtl/>
-          <w:lang w:val="fa-IR" w:bidi="fa-IR"/>
-        </w:rPr>
-        <w:t xml:space="preserve">قبل از ورود به بخش اصلی این فایل یک فایل برای بخش </w:t>
-      </w:r>
-      <w:proofErr w:type="spellStart"/>
-      <w:r>
-        <w:rPr>
-          <w:sz w:val="24"/>
-          <w:lang w:bidi="fa-IR"/>
-        </w:rPr>
-        <w:t>data_undrestandtion</w:t>
-      </w:r>
-      <w:proofErr w:type="spellEnd"/>
-      <w:r>
-        <w:rPr>
-          <w:sz w:val="24"/>
-          <w:lang w:bidi="fa-IR"/>
-        </w:rPr>
-        <w:t xml:space="preserve"> </w:t>
-      </w:r>
-      <w:r>
-        <w:rPr>
-          <w:rFonts w:hint="cs"/>
-          <w:sz w:val="24"/>
-          <w:rtl/>
-          <w:lang w:bidi="fa-IR"/>
-        </w:rPr>
-        <w:t xml:space="preserve"> بصورت داک با کمک هوش مصنوعی اماده کردم چون وقت خوندن مستندات سایت </w:t>
-      </w:r>
-      <w:r>
-        <w:rPr>
-          <w:sz w:val="24"/>
-          <w:lang w:bidi="fa-IR"/>
-        </w:rPr>
-        <w:t xml:space="preserve">data provider </w:t>
-      </w:r>
-      <w:r>
-        <w:rPr>
-          <w:rFonts w:hint="cs"/>
-          <w:sz w:val="24"/>
-          <w:rtl/>
-          <w:lang w:bidi="fa-IR"/>
-        </w:rPr>
-        <w:t xml:space="preserve"> رو نداشتم ولی در یک فایل داکیومنت جدا گذاشتم تا این فایل زیادی شلوغ نشه.</w:t>
+        <w:jc w:val="start"/>
+        <w:keepLines/>
+        <w:widowControl/>
+        <w:bidi w:val="1"/>
+      </w:pPr>
+      <w:r>
+        <w:rPr>
+          <w:rtl w:val="1"/>
+          <w:szCs w:val="21"/>
+        </w:rPr>
+        <w:t>احسان سویزی</w:t>
+      </w:r>
+    </w:p>
+    <w:p>
+      <w:pPr>
+        <w:pStyle w:val="Heading1"/>
+        <w:spacing w:before="160"/>
+        <w:jc w:val="start"/>
+        <w:keepNext/>
+        <w:keepLines/>
+        <w:widowControl/>
+        <w:bidi w:val="1"/>
+      </w:pPr>
+      <w:r>
+        <w:rPr>
+          <w:rtl w:val="1"/>
+          <w:szCs w:val="23"/>
+          <w:bCs w:val="1"/>
+        </w:rPr>
+        <w:t>فهم مسئله و وضعیت فعلی</w:t>
+      </w:r>
+    </w:p>
+    <w:p>
+      <w:pPr>
+        <w:jc w:val="start"/>
+        <w:keepLines/>
+        <w:widowControl/>
+        <w:bidi w:val="1"/>
+      </w:pPr>
+      <w:r>
+        <w:rPr>
+          <w:rtl w:val="1"/>
+          <w:szCs w:val="21"/>
+        </w:rPr>
+        <w:t xml:space="preserve">هدف این مرحله، ساختن دادهٔ قابل اتکا برای مقایسهٔ مدت بسته‌شدن درخواست‌های شهری برحسب منطقه، نوع شکایت و ماه است. محصول، یک دیتاست در سطح پرونده، جدول ماهانهٔ عریض با نرخ جمعیتی و </w:t>
+      </w:r>
+      <w:r>
+        <w:rPr>
+          <w:rtl w:val="0"/>
+          <w:szCs w:val="21"/>
+        </w:rPr>
+        <w:t>manifest</w:t>
+      </w:r>
+      <w:r>
+        <w:rPr>
+          <w:rtl w:val="1"/>
+          <w:szCs w:val="21"/>
+        </w:rPr>
+        <w:t xml:space="preserve"> قابل حسابرسی است. بسته‌شدن اداری لزوماً حل واقعی مشکل نیست؛ بنابراین از این داده دربارهٔ رضایت شهروند یا کیفیت واقعی خدمت نتیجهٔ قطعی نمی‌گیریم.</w:t>
+      </w:r>
+    </w:p>
+    <w:p>
+      <w:pPr>
+        <w:jc w:val="start"/>
+        <w:keepLines/>
+        <w:widowControl/>
+        <w:bidi w:val="1"/>
+      </w:pPr>
+      <w:r>
+        <w:rPr>
+          <w:rtl w:val="1"/>
+          <w:szCs w:val="21"/>
+        </w:rPr>
+        <w:t xml:space="preserve">دامنه، پنج نوع شکایت سر‌وصدا در همهٔ </w:t>
+      </w:r>
+      <w:r>
+        <w:rPr>
+          <w:rtl w:val="0"/>
+          <w:szCs w:val="21"/>
+        </w:rPr>
+        <w:t>borough</w:t>
+      </w:r>
+      <w:r>
+        <w:rPr>
+          <w:rtl w:val="1"/>
+          <w:szCs w:val="21"/>
+        </w:rPr>
+        <w:t xml:space="preserve">ها از ابتدای ژانویهٔ ۲۰۲۴ تا ابتدای ژوئیهٔ ۲۰۲۵ است. </w:t>
+      </w:r>
+      <w:r>
+        <w:rPr>
+          <w:rtl w:val="0"/>
+          <w:szCs w:val="21"/>
+        </w:rPr>
+        <w:t>snapshot</w:t>
+      </w:r>
+      <w:r>
+        <w:rPr>
+          <w:rtl w:val="1"/>
+          <w:szCs w:val="21"/>
+        </w:rPr>
+        <w:t xml:space="preserve"> موجود </w:t>
+      </w:r>
+      <w:r>
+        <w:rPr>
+          <w:rtl w:val="0"/>
+          <w:szCs w:val="21"/>
+        </w:rPr>
+        <w:t>330,000</w:t>
+      </w:r>
+      <w:r>
+        <w:rPr>
+          <w:rtl w:val="1"/>
+          <w:szCs w:val="21"/>
+        </w:rPr>
+        <w:t xml:space="preserve"> رکورد خام و به همان تعداد رکورد پذیرفته‌شده دارد؛ </w:t>
+      </w:r>
+      <w:r>
+        <w:rPr>
+          <w:rtl w:val="0"/>
+          <w:szCs w:val="21"/>
+        </w:rPr>
+        <w:t>0</w:t>
+      </w:r>
+      <w:r>
+        <w:rPr>
+          <w:rtl w:val="1"/>
+          <w:szCs w:val="21"/>
+        </w:rPr>
+        <w:t xml:space="preserve"> رکورد در این </w:t>
+      </w:r>
+      <w:r>
+        <w:rPr>
+          <w:rtl w:val="0"/>
+          <w:szCs w:val="21"/>
+        </w:rPr>
+        <w:t>snapshot</w:t>
+      </w:r>
+      <w:r>
+        <w:rPr>
+          <w:rtl w:val="1"/>
+          <w:szCs w:val="21"/>
+        </w:rPr>
+        <w:t xml:space="preserve"> قرنطینه شده است. نبود قرنطینه به معنی نبود خطای اختیاری نیست؛ اصلاحات اختیاری و مشکلات اتصال جدا گزارش می‌شوند. پوشش فعلی تا ۲۵ ژوئیهٔ ۲۰۲۴ است و با وجود عبور از کف حجم، دریافت کل بازه هنوز کامل نشده است. اعداد در بخش‌های اعتبارسنجی، خروجی نهایی و وضعیت تحویل نوت‌بوک قابل پیگیری‌اند.</w:t>
+      </w:r>
+    </w:p>
+    <w:p>
+      <w:pPr>
+        <w:pStyle w:val="Heading1"/>
+        <w:spacing w:before="160"/>
+        <w:jc w:val="start"/>
+        <w:keepNext/>
+        <w:keepLines/>
+        <w:widowControl/>
+        <w:bidi w:val="1"/>
+      </w:pPr>
+      <w:r>
+        <w:rPr>
+          <w:rtl w:val="1"/>
+          <w:szCs w:val="23"/>
+          <w:bCs w:val="1"/>
+        </w:rPr>
+        <w:t>تصمیم‌های کلیدی</w:t>
       </w:r>
     </w:p>
     <w:p>
       <w:pPr>
         <w:pStyle w:val="Heading2"/>
-        <w:bidi/>
-        <w:spacing w:before="80" w:after="100" w:line="293" w:lineRule="auto"/>
-      </w:pPr>
-      <w:r>
-        <w:rPr>
-          <w:rFonts w:ascii="Tahoma" w:eastAsia="Tahoma" w:hAnsi="Tahoma" w:cs="Tahoma"/>
-          <w:b/>
-          <w:bCs/>
-          <w:sz w:val="23"/>
+        <w:spacing w:before="160"/>
+        <w:jc w:val="start"/>
+        <w:keepNext/>
+        <w:keepLines/>
+        <w:widowControl/>
+        <w:bidi w:val="1"/>
+      </w:pPr>
+      <w:r>
+        <w:rPr>
+          <w:rtl w:val="1"/>
           <w:szCs w:val="23"/>
-          <w:rtl/>
-          <w:lang w:val="fa-IR" w:bidi="fa-IR"/>
-        </w:rPr>
-        <w:t>هدف و دامنه انتخاب‌شده</w:t>
-      </w:r>
-    </w:p>
-    <w:p>
-      <w:pPr>
-        <w:bidi/>
-        <w:spacing w:after="120" w:line="293" w:lineRule="auto"/>
-        <w:rPr>
-          <w:szCs w:val="21"/>
-          <w:rtl/>
-          <w:lang w:bidi="fa-IR"/>
-        </w:rPr>
-      </w:pPr>
-      <w:r>
-        <w:rPr>
-          <w:szCs w:val="21"/>
-          <w:rtl/>
-          <w:lang w:val="fa-IR" w:bidi="fa-IR"/>
-        </w:rPr>
-        <w:t xml:space="preserve">هدف این مرحله تهیه داده قابل اتکا برای بررسی مدت بسته‌شدن درخواست‌ها و مقایسه آن بر حسب مکان، نوع شکایت و ماه است. منبع اصلی، داده عمومی سامانه </w:t>
-      </w:r>
-      <w:r>
-        <w:rPr>
-          <w:szCs w:val="21"/>
-          <w:lang w:val="fa-IR" w:bidi="fa-IR"/>
-        </w:rPr>
-        <w:t>NYC311</w:t>
-      </w:r>
-      <w:r>
-        <w:rPr>
-          <w:szCs w:val="21"/>
-          <w:rtl/>
-          <w:lang w:val="fa-IR" w:bidi="fa-IR"/>
-        </w:rPr>
-        <w:t xml:space="preserve"> با شناسه </w:t>
-      </w:r>
-      <w:r>
-        <w:rPr>
-          <w:szCs w:val="21"/>
-          <w:lang w:val="fa-IR" w:bidi="fa-IR"/>
-        </w:rPr>
-        <w:t>erm2-nwe9</w:t>
-      </w:r>
-      <w:r>
-        <w:rPr>
-          <w:szCs w:val="21"/>
-          <w:rtl/>
-          <w:lang w:val="fa-IR" w:bidi="fa-IR"/>
-        </w:rPr>
-        <w:t xml:space="preserve"> است. </w:t>
-      </w:r>
-    </w:p>
-    <w:p>
-      <w:pPr>
-        <w:bidi/>
-        <w:spacing w:after="120" w:line="293" w:lineRule="auto"/>
-        <w:rPr>
-          <w:rFonts w:hint="cs"/>
-          <w:szCs w:val="21"/>
-          <w:rtl/>
-          <w:lang w:bidi="fa-IR"/>
-        </w:rPr>
-      </w:pPr>
-      <w:r>
-        <w:rPr>
-          <w:rFonts w:hint="cs"/>
-          <w:szCs w:val="21"/>
-          <w:rtl/>
-          <w:lang w:bidi="fa-IR"/>
-        </w:rPr>
-        <w:t>محدودیت اعمال شده برای انتخاب ریکورد ها در یک بازه زمانی ۱۸ ماهه مشخص یک فیلتر روی نوع شکایات هست و تنها شامل ۵ بخش از شکایاتی میشود که مربوط به سروصدا میباشند.</w:t>
-      </w:r>
-    </w:p>
-    <w:tbl>
-      <w:tblPr>
-        <w:bidiVisual/>
-        <w:tblW w:w="9865" w:type="dxa"/>
-        <w:jc w:val="center"/>
-        <w:tblBorders>
-          <w:top w:val="single" w:sz="4" w:space="0" w:color="D9D9D9"/>
-          <w:left w:val="single" w:sz="4" w:space="0" w:color="D9D9D9"/>
-          <w:bottom w:val="single" w:sz="4" w:space="0" w:color="D9D9D9"/>
-          <w:right w:val="single" w:sz="4" w:space="0" w:color="D9D9D9"/>
-          <w:insideH w:val="single" w:sz="4" w:space="0" w:color="D9D9D9"/>
-          <w:insideV w:val="single" w:sz="4" w:space="0" w:color="D9D9D9"/>
-        </w:tblBorders>
-        <w:tblLayout w:type="fixed"/>
-        <w:tblCellMar>
-          <w:top w:w="85" w:type="dxa"/>
-          <w:left w:w="90" w:type="dxa"/>
-          <w:bottom w:w="85" w:type="dxa"/>
-          <w:right w:w="90" w:type="dxa"/>
-        </w:tblCellMar>
-        <w:tblLook w:val="04A0" w:firstRow="1" w:lastRow="0" w:firstColumn="1" w:lastColumn="0" w:noHBand="0" w:noVBand="1"/>
-      </w:tblPr>
-      <w:tblGrid>
-        <w:gridCol w:w="2041"/>
-        <w:gridCol w:w="7824"/>
-      </w:tblGrid>
-      <w:tr>
-        <w:trPr>
-          <w:cantSplit/>
-          <w:tblHeader/>
-          <w:jc w:val="center"/>
-        </w:trPr>
-        <w:tc>
-          <w:tcPr>
-            <w:tcW w:w="2041" w:type="dxa"/>
-            <w:shd w:val="clear" w:color="auto" w:fill="264C63"/>
-            <w:vAlign w:val="center"/>
-          </w:tcPr>
-          <w:p>
-            <w:pPr>
-              <w:bidi/>
-              <w:spacing w:after="0" w:line="274" w:lineRule="auto"/>
-            </w:pPr>
-            <w:r>
-              <w:rPr>
-                <w:b/>
-                <w:bCs/>
-                <w:color w:val="FFFFFF"/>
-                <w:sz w:val="18"/>
-                <w:szCs w:val="18"/>
-                <w:rtl/>
-                <w:lang w:val="fa-IR" w:bidi="fa-IR"/>
-              </w:rPr>
-              <w:t>تصمیم</w:t>
-            </w:r>
-          </w:p>
-        </w:tc>
-        <w:tc>
-          <w:tcPr>
-            <w:tcW w:w="7824" w:type="dxa"/>
-            <w:shd w:val="clear" w:color="auto" w:fill="264C63"/>
-            <w:vAlign w:val="center"/>
-          </w:tcPr>
-          <w:p>
-            <w:pPr>
-              <w:bidi/>
-              <w:spacing w:after="0" w:line="274" w:lineRule="auto"/>
-            </w:pPr>
-            <w:r>
-              <w:rPr>
-                <w:b/>
-                <w:bCs/>
-                <w:color w:val="FFFFFF"/>
-                <w:sz w:val="18"/>
-                <w:szCs w:val="18"/>
-                <w:rtl/>
-                <w:lang w:val="fa-IR" w:bidi="fa-IR"/>
-              </w:rPr>
-              <w:t>مقدار ثبت‌شده در تنظیمات</w:t>
-            </w:r>
-          </w:p>
-        </w:tc>
-      </w:tr>
-      <w:tr>
-        <w:trPr>
-          <w:cantSplit/>
-          <w:jc w:val="center"/>
-        </w:trPr>
-        <w:tc>
-          <w:tcPr>
-            <w:tcW w:w="2041" w:type="dxa"/>
-            <w:shd w:val="clear" w:color="auto" w:fill="FFFFFF"/>
-            <w:vAlign w:val="center"/>
-          </w:tcPr>
-          <w:p>
-            <w:pPr>
-              <w:bidi/>
-              <w:spacing w:after="0" w:line="274" w:lineRule="auto"/>
-            </w:pPr>
-            <w:r>
-              <w:rPr>
-                <w:sz w:val="18"/>
-                <w:szCs w:val="18"/>
-                <w:rtl/>
-                <w:lang w:val="fa-IR" w:bidi="fa-IR"/>
-              </w:rPr>
-              <w:t>بازه ثبت پرونده</w:t>
-            </w:r>
-          </w:p>
-        </w:tc>
-        <w:tc>
-          <w:tcPr>
-            <w:tcW w:w="7824" w:type="dxa"/>
-            <w:shd w:val="clear" w:color="auto" w:fill="FFFFFF"/>
-            <w:vAlign w:val="center"/>
-          </w:tcPr>
-          <w:p>
-            <w:pPr>
-              <w:bidi/>
-              <w:spacing w:after="0" w:line="274" w:lineRule="auto"/>
-            </w:pPr>
-            <w:r>
-              <w:rPr>
-                <w:sz w:val="18"/>
-                <w:szCs w:val="18"/>
-                <w:rtl/>
-                <w:lang w:val="fa-IR" w:bidi="fa-IR"/>
-              </w:rPr>
-              <w:t xml:space="preserve">از </w:t>
-            </w:r>
-            <w:r>
-              <w:rPr>
-                <w:sz w:val="18"/>
-                <w:szCs w:val="18"/>
-                <w:lang w:val="fa-IR" w:bidi="fa-IR"/>
-              </w:rPr>
-              <w:t>2024-01-01</w:t>
-            </w:r>
-            <w:r>
-              <w:rPr>
-                <w:sz w:val="18"/>
-                <w:szCs w:val="18"/>
-                <w:rtl/>
-                <w:lang w:val="fa-IR" w:bidi="fa-IR"/>
-              </w:rPr>
-              <w:t xml:space="preserve"> شامل شروع تا </w:t>
-            </w:r>
-            <w:r>
-              <w:rPr>
-                <w:sz w:val="18"/>
-                <w:szCs w:val="18"/>
-                <w:lang w:val="fa-IR" w:bidi="fa-IR"/>
-              </w:rPr>
-              <w:t>2025-07-01</w:t>
-            </w:r>
-            <w:r>
-              <w:rPr>
-                <w:sz w:val="18"/>
-                <w:szCs w:val="18"/>
-                <w:rtl/>
-                <w:lang w:val="fa-IR" w:bidi="fa-IR"/>
-              </w:rPr>
-              <w:t xml:space="preserve"> بدون شامل‌شدن پایان؛ ۱۸ ماه کامل</w:t>
-            </w:r>
-          </w:p>
-        </w:tc>
-      </w:tr>
-      <w:tr>
-        <w:trPr>
-          <w:cantSplit/>
-          <w:jc w:val="center"/>
-        </w:trPr>
-        <w:tc>
-          <w:tcPr>
-            <w:tcW w:w="2041" w:type="dxa"/>
-            <w:shd w:val="clear" w:color="auto" w:fill="F1F5F8"/>
-            <w:vAlign w:val="center"/>
-          </w:tcPr>
-          <w:p>
-            <w:pPr>
-              <w:bidi/>
-              <w:spacing w:after="0" w:line="274" w:lineRule="auto"/>
-            </w:pPr>
-            <w:r>
-              <w:rPr>
-                <w:sz w:val="18"/>
-                <w:szCs w:val="18"/>
-                <w:rtl/>
-                <w:lang w:val="fa-IR" w:bidi="fa-IR"/>
-              </w:rPr>
-              <w:t>محدوده مکانی</w:t>
-            </w:r>
-          </w:p>
-        </w:tc>
-        <w:tc>
-          <w:tcPr>
-            <w:tcW w:w="7824" w:type="dxa"/>
-            <w:shd w:val="clear" w:color="auto" w:fill="F1F5F8"/>
-            <w:vAlign w:val="center"/>
-          </w:tcPr>
-          <w:p>
-            <w:pPr>
-              <w:bidi/>
-              <w:spacing w:after="0" w:line="274" w:lineRule="auto"/>
-            </w:pPr>
-            <w:r>
-              <w:rPr>
-                <w:sz w:val="18"/>
-                <w:szCs w:val="18"/>
-                <w:rtl/>
-                <w:lang w:val="fa-IR" w:bidi="fa-IR"/>
-              </w:rPr>
-              <w:t xml:space="preserve">بدون فیلتر </w:t>
-            </w:r>
-            <w:r>
-              <w:rPr>
-                <w:sz w:val="18"/>
-                <w:szCs w:val="18"/>
-                <w:lang w:val="fa-IR" w:bidi="fa-IR"/>
-              </w:rPr>
-              <w:t>borough</w:t>
-            </w:r>
-            <w:r>
-              <w:rPr>
-                <w:sz w:val="18"/>
-                <w:szCs w:val="18"/>
-                <w:rtl/>
-                <w:lang w:val="fa-IR" w:bidi="fa-IR"/>
-              </w:rPr>
-              <w:t>؛ مناطق مختلف نیویورک در دامنه قرار دارند</w:t>
-            </w:r>
-          </w:p>
-        </w:tc>
-      </w:tr>
-      <w:tr>
-        <w:trPr>
-          <w:cantSplit/>
-          <w:jc w:val="center"/>
-        </w:trPr>
-        <w:tc>
-          <w:tcPr>
-            <w:tcW w:w="2041" w:type="dxa"/>
-            <w:shd w:val="clear" w:color="auto" w:fill="FFFFFF"/>
-            <w:vAlign w:val="center"/>
-          </w:tcPr>
-          <w:p>
-            <w:pPr>
-              <w:bidi/>
-              <w:spacing w:after="0" w:line="274" w:lineRule="auto"/>
-            </w:pPr>
-            <w:r>
-              <w:rPr>
-                <w:sz w:val="18"/>
-                <w:szCs w:val="18"/>
-                <w:rtl/>
-                <w:lang w:val="fa-IR" w:bidi="fa-IR"/>
-              </w:rPr>
-              <w:t>نوع شکایت</w:t>
-            </w:r>
-          </w:p>
-        </w:tc>
-        <w:tc>
-          <w:tcPr>
-            <w:tcW w:w="7824" w:type="dxa"/>
-            <w:shd w:val="clear" w:color="auto" w:fill="FFFFFF"/>
-            <w:vAlign w:val="center"/>
-          </w:tcPr>
-          <w:p>
-            <w:pPr>
-              <w:bidi/>
-              <w:spacing w:after="0" w:line="274" w:lineRule="auto"/>
-            </w:pPr>
-            <w:r>
-              <w:rPr>
-                <w:sz w:val="18"/>
-                <w:szCs w:val="18"/>
-                <w:lang w:val="fa-IR" w:bidi="fa-IR"/>
-              </w:rPr>
-              <w:t>Noise - Residential</w:t>
-            </w:r>
-            <w:r>
-              <w:rPr>
-                <w:sz w:val="18"/>
-                <w:szCs w:val="18"/>
-                <w:rtl/>
-                <w:lang w:val="fa-IR" w:bidi="fa-IR"/>
-              </w:rPr>
-              <w:br/>
-            </w:r>
-            <w:r>
-              <w:rPr>
-                <w:sz w:val="18"/>
-                <w:szCs w:val="18"/>
-                <w:lang w:val="fa-IR" w:bidi="fa-IR"/>
-              </w:rPr>
-              <w:t>Noise - Vehicle</w:t>
-            </w:r>
-            <w:r>
-              <w:rPr>
-                <w:sz w:val="18"/>
-                <w:szCs w:val="18"/>
-                <w:rtl/>
-                <w:lang w:val="fa-IR" w:bidi="fa-IR"/>
-              </w:rPr>
-              <w:br/>
-            </w:r>
-            <w:r>
-              <w:rPr>
-                <w:sz w:val="18"/>
-                <w:szCs w:val="18"/>
-                <w:lang w:val="fa-IR" w:bidi="fa-IR"/>
-              </w:rPr>
-              <w:t>Noise - Street/Sidewalk</w:t>
-            </w:r>
-            <w:r>
-              <w:rPr>
-                <w:sz w:val="18"/>
-                <w:szCs w:val="18"/>
-                <w:rtl/>
-                <w:lang w:val="fa-IR" w:bidi="fa-IR"/>
-              </w:rPr>
-              <w:br/>
-            </w:r>
-            <w:r>
-              <w:rPr>
-                <w:sz w:val="18"/>
-                <w:szCs w:val="18"/>
-                <w:lang w:val="fa-IR" w:bidi="fa-IR"/>
-              </w:rPr>
-              <w:t>Noise - Park</w:t>
-            </w:r>
-            <w:r>
-              <w:rPr>
-                <w:sz w:val="18"/>
-                <w:szCs w:val="18"/>
-                <w:rtl/>
-                <w:lang w:val="fa-IR" w:bidi="fa-IR"/>
-              </w:rPr>
-              <w:br/>
-            </w:r>
-            <w:r>
-              <w:rPr>
-                <w:sz w:val="18"/>
-                <w:szCs w:val="18"/>
-                <w:lang w:val="fa-IR" w:bidi="fa-IR"/>
-              </w:rPr>
-              <w:t>Noise - Commercial</w:t>
-            </w:r>
-          </w:p>
-        </w:tc>
-      </w:tr>
-      <w:tr>
-        <w:trPr>
-          <w:cantSplit/>
-          <w:jc w:val="center"/>
-        </w:trPr>
-        <w:tc>
-          <w:tcPr>
-            <w:tcW w:w="2041" w:type="dxa"/>
-            <w:shd w:val="clear" w:color="auto" w:fill="F1F5F8"/>
-            <w:vAlign w:val="center"/>
-          </w:tcPr>
-          <w:p>
-            <w:pPr>
-              <w:bidi/>
-              <w:spacing w:after="0" w:line="274" w:lineRule="auto"/>
-            </w:pPr>
-            <w:r>
-              <w:rPr>
-                <w:sz w:val="18"/>
-                <w:szCs w:val="18"/>
-                <w:rtl/>
-                <w:lang w:val="fa-IR" w:bidi="fa-IR"/>
-              </w:rPr>
-              <w:t>وضعیت و سازمان</w:t>
-            </w:r>
-          </w:p>
-        </w:tc>
-        <w:tc>
-          <w:tcPr>
-            <w:tcW w:w="7824" w:type="dxa"/>
-            <w:shd w:val="clear" w:color="auto" w:fill="F1F5F8"/>
-            <w:vAlign w:val="center"/>
-          </w:tcPr>
-          <w:p>
-            <w:pPr>
-              <w:bidi/>
-              <w:spacing w:after="0" w:line="274" w:lineRule="auto"/>
-            </w:pPr>
-            <w:r>
-              <w:rPr>
-                <w:sz w:val="18"/>
-                <w:szCs w:val="18"/>
-                <w:rtl/>
-                <w:lang w:val="fa-IR" w:bidi="fa-IR"/>
-              </w:rPr>
-              <w:t xml:space="preserve">فیلتر اختصاصی برای </w:t>
-            </w:r>
-            <w:r>
-              <w:rPr>
-                <w:sz w:val="18"/>
-                <w:szCs w:val="18"/>
-                <w:lang w:val="fa-IR" w:bidi="fa-IR"/>
-              </w:rPr>
-              <w:t>status</w:t>
-            </w:r>
-            <w:r>
-              <w:rPr>
-                <w:sz w:val="18"/>
-                <w:szCs w:val="18"/>
-                <w:rtl/>
-                <w:lang w:val="fa-IR" w:bidi="fa-IR"/>
-              </w:rPr>
-              <w:t xml:space="preserve"> یا </w:t>
-            </w:r>
-            <w:r>
-              <w:rPr>
-                <w:sz w:val="18"/>
-                <w:szCs w:val="18"/>
-                <w:lang w:val="fa-IR" w:bidi="fa-IR"/>
-              </w:rPr>
-              <w:t>agency</w:t>
-            </w:r>
-            <w:r>
-              <w:rPr>
-                <w:sz w:val="18"/>
-                <w:szCs w:val="18"/>
-                <w:rtl/>
-                <w:lang w:val="fa-IR" w:bidi="fa-IR"/>
-              </w:rPr>
-              <w:t xml:space="preserve"> اعمال نشده است</w:t>
-            </w:r>
-          </w:p>
-        </w:tc>
-      </w:tr>
-      <w:tr>
-        <w:trPr>
-          <w:cantSplit/>
-          <w:jc w:val="center"/>
-        </w:trPr>
-        <w:tc>
-          <w:tcPr>
-            <w:tcW w:w="2041" w:type="dxa"/>
-            <w:shd w:val="clear" w:color="auto" w:fill="FFFFFF"/>
-            <w:vAlign w:val="center"/>
-          </w:tcPr>
-          <w:p>
-            <w:pPr>
-              <w:bidi/>
-              <w:spacing w:after="0" w:line="274" w:lineRule="auto"/>
-            </w:pPr>
-            <w:r>
-              <w:rPr>
-                <w:sz w:val="18"/>
-                <w:szCs w:val="18"/>
-                <w:rtl/>
-                <w:lang w:val="fa-IR" w:bidi="fa-IR"/>
-              </w:rPr>
-              <w:t>شمارش فعلی</w:t>
-            </w:r>
-          </w:p>
-        </w:tc>
-        <w:tc>
-          <w:tcPr>
-            <w:tcW w:w="7824" w:type="dxa"/>
-            <w:shd w:val="clear" w:color="auto" w:fill="FFFFFF"/>
-            <w:vAlign w:val="center"/>
-          </w:tcPr>
-          <w:p>
-            <w:pPr>
-              <w:bidi/>
-              <w:spacing w:after="0" w:line="274" w:lineRule="auto"/>
-            </w:pPr>
-            <w:r>
-              <w:rPr>
-                <w:sz w:val="18"/>
-                <w:szCs w:val="18"/>
-                <w:rtl/>
-                <w:lang w:val="fa-IR" w:bidi="fa-IR"/>
-              </w:rPr>
-              <w:t>۱٬۰۱۷٬۶۳۵ پرونده منطبق؛ بیشتر از حداقل ۳۰۰٬۰۰۰ رکورد چالش</w:t>
-            </w:r>
-          </w:p>
-        </w:tc>
-      </w:tr>
-    </w:tbl>
-    <w:p>
-      <w:pPr>
+          <w:bCs w:val="1"/>
+        </w:rPr>
+        <w:t>دامنهٔ موضوعی با حفظ تنوع مکانی</w:t>
+      </w:r>
+    </w:p>
+    <w:p>
+      <w:pPr>
+        <w:jc w:val="start"/>
+        <w:keepLines/>
+        <w:widowControl/>
+        <w:bidi w:val="1"/>
+      </w:pPr>
+      <w:r>
+        <w:rPr>
+          <w:rtl w:val="1"/>
+          <w:szCs w:val="21"/>
+        </w:rPr>
+        <w:t xml:space="preserve">می‌توانستیم فقط یک </w:t>
+      </w:r>
+      <w:r>
+        <w:rPr>
+          <w:rtl w:val="0"/>
+          <w:szCs w:val="21"/>
+        </w:rPr>
+        <w:t>borough</w:t>
+      </w:r>
+      <w:r>
+        <w:rPr>
+          <w:rtl w:val="1"/>
+          <w:szCs w:val="21"/>
+        </w:rPr>
+        <w:t xml:space="preserve">، یک </w:t>
+      </w:r>
+      <w:r>
+        <w:rPr>
+          <w:rtl w:val="0"/>
+          <w:szCs w:val="21"/>
+        </w:rPr>
+        <w:t>agency</w:t>
+      </w:r>
+      <w:r>
+        <w:rPr>
+          <w:rtl w:val="1"/>
+          <w:szCs w:val="21"/>
+        </w:rPr>
+        <w:t xml:space="preserve"> یا چند نوع شکایت را انتخاب کنیم. محدودسازی به پنج گروه سر‌وصدا را انتخاب کردیم تا مقایسهٔ مکانی از بین نرود و مسئله از نظر موضوعی منسجم بماند. انتخاب یک </w:t>
+      </w:r>
+      <w:r>
+        <w:rPr>
+          <w:rtl w:val="0"/>
+          <w:szCs w:val="21"/>
+        </w:rPr>
+        <w:t>borough</w:t>
+      </w:r>
+      <w:r>
+        <w:rPr>
+          <w:rtl w:val="1"/>
+          <w:szCs w:val="21"/>
+        </w:rPr>
+        <w:t xml:space="preserve"> برای تحلیل نهایی محدودکننده بود؛ </w:t>
+      </w:r>
+      <w:r>
+        <w:rPr>
+          <w:rtl w:val="0"/>
+          <w:szCs w:val="21"/>
+        </w:rPr>
+        <w:t>agency</w:t>
+      </w:r>
+      <w:r>
+        <w:rPr>
+          <w:rtl w:val="1"/>
+          <w:szCs w:val="21"/>
+        </w:rPr>
+        <w:t xml:space="preserve"> هم عملاً موضوع رسیدگی را محدود می‌کرد. بهای این انتخاب، کنارگذاشتن سایر موضوعات ۳۱۱ است. حتی همهٔ دسته‌های سر‌وصدا در دامنه نیستند؛ یافته‌ها فقط دربارهٔ انتخاب فعلی معتبرند و دریافت در رکورد سیصدهزارم متوقف نمی‌شود.</w:t>
+      </w:r>
+    </w:p>
+    <w:p>
+      <w:pPr>
+        <w:pStyle w:val="Heading2"/>
+        <w:spacing w:before="160"/>
+        <w:jc w:val="start"/>
         <w:keepNext/>
-        <w:spacing w:after="0" w:line="72" w:lineRule="auto"/>
-      </w:pPr>
+        <w:keepLines/>
+        <w:widowControl/>
+        <w:bidi w:val="1"/>
+      </w:pPr>
+      <w:r>
+        <w:rPr>
+          <w:rtl w:val="1"/>
+          <w:szCs w:val="23"/>
+          <w:bCs w:val="1"/>
+        </w:rPr>
+        <w:t xml:space="preserve">ادامه از </w:t>
+      </w:r>
+      <w:r>
+        <w:rPr>
+          <w:rtl w:val="0"/>
+          <w:szCs w:val="23"/>
+          <w:bCs w:val="1"/>
+        </w:rPr>
+        <w:t>cursor</w:t>
+      </w:r>
+      <w:r>
+        <w:rPr>
+          <w:rtl w:val="1"/>
+          <w:szCs w:val="23"/>
+          <w:bCs w:val="1"/>
+        </w:rPr>
+        <w:t xml:space="preserve"> به جای بازخوانی یا </w:t>
+      </w:r>
+      <w:r>
+        <w:rPr>
+          <w:rtl w:val="0"/>
+          <w:szCs w:val="23"/>
+          <w:bCs w:val="1"/>
+        </w:rPr>
+        <w:t>offset</w:t>
+      </w:r>
+    </w:p>
+    <w:p>
+      <w:pPr>
+        <w:jc w:val="start"/>
+        <w:keepLines/>
+        <w:widowControl/>
+        <w:bidi w:val="1"/>
+      </w:pPr>
+      <w:r>
+        <w:rPr>
+          <w:rtl w:val="1"/>
+          <w:szCs w:val="21"/>
+        </w:rPr>
+        <w:t xml:space="preserve">بین دریافت دوبارهٔ کل داده، صفحه‌بندی با </w:t>
+      </w:r>
+      <w:r>
+        <w:rPr>
+          <w:rtl w:val="0"/>
+          <w:szCs w:val="21"/>
+        </w:rPr>
+        <w:t>offset</w:t>
+      </w:r>
+      <w:r>
+        <w:rPr>
+          <w:rtl w:val="1"/>
+          <w:szCs w:val="21"/>
+        </w:rPr>
+        <w:t xml:space="preserve"> و ادامه از آخرین زوج زمان ایجاد و شناسه، گزینهٔ آخر انتخاب شد. </w:t>
+      </w:r>
+      <w:r>
+        <w:rPr>
+          <w:rtl w:val="0"/>
+          <w:szCs w:val="21"/>
+        </w:rPr>
+        <w:t>timestamp</w:t>
+      </w:r>
+      <w:r>
+        <w:rPr>
+          <w:rtl w:val="1"/>
+          <w:szCs w:val="21"/>
+        </w:rPr>
+        <w:t xml:space="preserve"> به‌تنهایی کافی نیست، چون چند پرونده می‌توانند زمان برابر داشته باشند. فایل خام پیش از </w:t>
+      </w:r>
+      <w:r>
+        <w:rPr>
+          <w:rtl w:val="0"/>
+          <w:szCs w:val="21"/>
+        </w:rPr>
+        <w:t>checkpoint</w:t>
+      </w:r>
+      <w:r>
+        <w:rPr>
+          <w:rtl w:val="1"/>
+          <w:szCs w:val="21"/>
+        </w:rPr>
+        <w:t xml:space="preserve"> نوشته می‌شود و فایل باقی‌مانده پس از وقفه بازیابی می‌شود. آزمون‌های وقفه، </w:t>
+      </w:r>
+      <w:r>
+        <w:rPr>
+          <w:rtl w:val="0"/>
+          <w:szCs w:val="21"/>
+        </w:rPr>
+        <w:t>timestamp</w:t>
+      </w:r>
+      <w:r>
+        <w:rPr>
+          <w:rtl w:val="1"/>
+          <w:szCs w:val="21"/>
+        </w:rPr>
+        <w:t xml:space="preserve"> مساوی و اجرای دوم از این تصمیم پشتیبانی می‌کنند. هزینهٔ آن، نگهداری حالت و بررسی هش فایل‌ها در شروع است؛ منبع زنده هم همچنان </w:t>
+      </w:r>
+      <w:r>
+        <w:rPr>
+          <w:rtl w:val="0"/>
+          <w:szCs w:val="21"/>
+        </w:rPr>
+        <w:t>snapshot</w:t>
+      </w:r>
+      <w:r>
+        <w:rPr>
+          <w:rtl w:val="1"/>
+          <w:szCs w:val="21"/>
+        </w:rPr>
+        <w:t xml:space="preserve"> تغییرناپذیر تضمین نمی‌کند.</w:t>
+      </w:r>
     </w:p>
     <w:p>
       <w:pPr>
         <w:pStyle w:val="Heading2"/>
-        <w:bidi/>
-        <w:spacing w:before="80" w:after="100" w:line="293" w:lineRule="auto"/>
-      </w:pPr>
-      <w:r>
-        <w:rPr>
-          <w:rFonts w:ascii="Tahoma" w:eastAsia="Tahoma" w:hAnsi="Tahoma" w:cs="Tahoma"/>
-          <w:b/>
-          <w:bCs/>
-          <w:sz w:val="23"/>
+        <w:spacing w:before="160"/>
+        <w:jc w:val="start"/>
+        <w:keepNext/>
+        <w:keepLines/>
+        <w:widowControl/>
+        <w:bidi w:val="1"/>
+      </w:pPr>
+      <w:r>
+        <w:rPr>
+          <w:rtl w:val="1"/>
           <w:szCs w:val="23"/>
-          <w:rtl/>
-          <w:lang w:val="fa-IR" w:bidi="fa-IR"/>
-        </w:rPr>
-        <w:t>دلیل انتخاب و پیامد آن</w:t>
-      </w:r>
-    </w:p>
-    <w:p>
-      <w:pPr>
-        <w:bidi/>
-        <w:spacing w:after="120" w:line="293" w:lineRule="auto"/>
-        <w:rPr>
-          <w:rFonts w:hint="cs"/>
-          <w:rtl/>
-        </w:rPr>
-      </w:pPr>
-      <w:r>
-        <w:rPr>
-          <w:szCs w:val="21"/>
-          <w:rtl/>
-          <w:lang w:val="fa-IR" w:bidi="fa-IR"/>
-        </w:rPr>
-        <w:t xml:space="preserve">محدودسازی موضوعی، مسئله را روی پنج محیط مشخص سر‌وصدا متمرکز می‌کند و در عین حال تنوع نوع شکایت را برای جدول ماهانه حفظ می‌کند. </w:t>
-      </w:r>
-      <w:r>
-        <w:rPr>
-          <w:rFonts w:hint="cs"/>
-          <w:szCs w:val="21"/>
-          <w:rtl/>
-          <w:lang w:val="fa-IR" w:bidi="fa-IR"/>
-        </w:rPr>
-        <w:t xml:space="preserve">در ابتدا تنها نوع فیلتر را روی منطقه مکانی </w:t>
-      </w:r>
-      <w:r>
-        <w:rPr>
-          <w:szCs w:val="21"/>
-          <w:lang w:bidi="fa-IR"/>
+          <w:bCs w:val="1"/>
+        </w:rPr>
+        <w:t>قرارداد سخت برای هویت و زمان با اصلاح محدود فیلد اختیاری</w:t>
+      </w:r>
+    </w:p>
+    <w:p>
+      <w:pPr>
+        <w:jc w:val="start"/>
+        <w:keepLines/>
+        <w:widowControl/>
+        <w:bidi w:val="1"/>
+      </w:pPr>
+      <w:r>
+        <w:rPr>
+          <w:rtl w:val="1"/>
+          <w:szCs w:val="21"/>
+        </w:rPr>
+        <w:t xml:space="preserve">حذف سطر ناقص، پرکردن یکسان همهٔ مقادیر و سیاست تفکیک‌شده سه گزینه بودند. شناسه، زمان ایجاد، </w:t>
+      </w:r>
+      <w:r>
+        <w:rPr>
+          <w:rtl w:val="0"/>
+          <w:szCs w:val="21"/>
+        </w:rPr>
+        <w:t>agency</w:t>
+      </w:r>
+      <w:r>
+        <w:rPr>
+          <w:rtl w:val="1"/>
+          <w:szCs w:val="21"/>
+        </w:rPr>
+        <w:t xml:space="preserve"> و نوع شکایت برای هویت و دامنه ضروری‌اند؛ نقض آن‌ها با دلیل قرنطینه می‌شود. فیلد اختیاری نامعتبر می‌تواند همراه </w:t>
+      </w:r>
+      <w:r>
+        <w:rPr>
+          <w:rtl w:val="0"/>
+          <w:szCs w:val="21"/>
+        </w:rPr>
+        <w:t>quality flag</w:t>
+      </w:r>
+      <w:r>
+        <w:rPr>
+          <w:rtl w:val="1"/>
+          <w:szCs w:val="21"/>
+        </w:rPr>
+        <w:t xml:space="preserve"> به </w:t>
+      </w:r>
+      <w:r>
+        <w:rPr>
+          <w:rtl w:val="0"/>
+          <w:szCs w:val="21"/>
+        </w:rPr>
+        <w:t>null</w:t>
+      </w:r>
+      <w:r>
+        <w:rPr>
+          <w:rtl w:val="1"/>
+          <w:szCs w:val="21"/>
+        </w:rPr>
+        <w:t xml:space="preserve"> تبدیل شود. تاریخ پایان خالی و مدت خالی حفظ می‌شوند؛ صفر معتبر است و مدت منفی قرنطینه می‌شود. آستانهٔ یک درصد یک </w:t>
+      </w:r>
+      <w:r>
+        <w:rPr>
+          <w:rtl w:val="0"/>
+          <w:szCs w:val="21"/>
+        </w:rPr>
+        <w:t>gate</w:t>
+      </w:r>
+      <w:r>
+        <w:rPr>
+          <w:rtl w:val="1"/>
+          <w:szCs w:val="21"/>
+        </w:rPr>
+        <w:t xml:space="preserve"> عملیاتی محافظه‌کارانه برای بررسی خطاهای سخت است، نه تضمین آماری کیفیت. بهای سیاست، پیچیدگی بیشتر قرارداد و باقی‌ماندن ابهام‌های اختیاری در دادهٔ پذیرفته‌شده است.</w:t>
+      </w:r>
+    </w:p>
+    <w:p>
+      <w:pPr>
+        <w:pStyle w:val="Heading2"/>
+        <w:spacing w:before="160"/>
+        <w:jc w:val="start"/>
+        <w:keepNext/>
+        <w:keepLines/>
+        <w:widowControl/>
+        <w:bidi w:val="1"/>
+      </w:pPr>
+      <w:r>
+        <w:rPr>
+          <w:rtl w:val="1"/>
+          <w:szCs w:val="23"/>
+          <w:bCs w:val="1"/>
+        </w:rPr>
+        <w:t>تکراری بر اساس شناسه با حفظ اولین رکورد معتبر</w:t>
+      </w:r>
+    </w:p>
+    <w:p>
+      <w:pPr>
+        <w:jc w:val="start"/>
+        <w:keepLines/>
+        <w:widowControl/>
+        <w:bidi w:val="1"/>
+      </w:pPr>
+      <w:r>
+        <w:rPr>
+          <w:rtl w:val="1"/>
+          <w:szCs w:val="21"/>
+        </w:rPr>
+        <w:t xml:space="preserve">یکی‌گرفتن پرونده‌های دارای نشانی و شکایت مشابه، حذف درخواست‌های مستقل شهروندان را در پی داشت. </w:t>
+      </w:r>
+      <w:r>
+        <w:rPr>
+          <w:rtl w:val="0"/>
+          <w:szCs w:val="21"/>
+        </w:rPr>
+        <w:t>unique_key</w:t>
+      </w:r>
+      <w:r>
+        <w:rPr>
+          <w:rtl w:val="1"/>
+          <w:szCs w:val="21"/>
+        </w:rPr>
+        <w:t xml:space="preserve"> معیار هویت است. اولین نمونهٔ معتبر پذیرفته می‌شود؛ نمونهٔ خام کاملاً یکسان با همان شناسه </w:t>
+      </w:r>
+      <w:r>
+        <w:rPr>
+          <w:rtl w:val="0"/>
+          <w:szCs w:val="21"/>
+        </w:rPr>
+        <w:t>duplicate</w:t>
+      </w:r>
+      <w:r>
+        <w:rPr>
+          <w:rtl w:val="1"/>
+          <w:szCs w:val="21"/>
+        </w:rPr>
+        <w:t xml:space="preserve"> و محتوای متفاوت با همان شناسه </w:t>
+      </w:r>
+      <w:r>
+        <w:rPr>
+          <w:rtl w:val="0"/>
+          <w:szCs w:val="21"/>
+        </w:rPr>
+        <w:t>conflict</w:t>
+      </w:r>
+      <w:r>
+        <w:rPr>
+          <w:rtl w:val="1"/>
+          <w:szCs w:val="21"/>
+        </w:rPr>
+        <w:t xml:space="preserve"> است. هر رد، رکورد اصلی و جایگاه آن را نگه می‌دارد. آزمون‌های بین </w:t>
+      </w:r>
+      <w:r>
+        <w:rPr>
+          <w:rtl w:val="0"/>
+          <w:szCs w:val="21"/>
+        </w:rPr>
+        <w:t>batch</w:t>
+      </w:r>
+      <w:r>
+        <w:rPr>
+          <w:rtl w:val="1"/>
+          <w:szCs w:val="21"/>
+        </w:rPr>
+        <w:t xml:space="preserve">ها و اولین رکورد نامعتبر این تصمیم را بررسی می‌کنند. بهای انتخاب این است که جدیدترین اصلاح منبع خودکار جایگزین نسخهٔ قبلی نمی‌شود؛ </w:t>
+      </w:r>
+      <w:r>
+        <w:rPr>
+          <w:rtl w:val="0"/>
+          <w:szCs w:val="21"/>
+        </w:rPr>
+        <w:t>refresh</w:t>
+      </w:r>
+      <w:r>
+        <w:rPr>
+          <w:rtl w:val="1"/>
+          <w:szCs w:val="21"/>
+        </w:rPr>
+        <w:t xml:space="preserve"> پرونده‌های قدیمی مسئله‌ای جداست.</w:t>
+      </w:r>
+    </w:p>
+    <w:p>
+      <w:pPr>
+        <w:pStyle w:val="Heading2"/>
+        <w:spacing w:before="160"/>
+        <w:jc w:val="start"/>
+        <w:keepNext/>
+        <w:keepLines/>
+        <w:widowControl/>
+        <w:bidi w:val="1"/>
+      </w:pPr>
+      <w:r>
+        <w:rPr>
+          <w:rtl w:val="1"/>
+          <w:szCs w:val="23"/>
+          <w:bCs w:val="1"/>
+        </w:rPr>
+        <w:t>اتصال جمعیت با حفظ همهٔ پرونده‌ها</w:t>
+      </w:r>
+    </w:p>
+    <w:p>
+      <w:pPr>
+        <w:jc w:val="start"/>
+        <w:keepLines/>
+        <w:widowControl/>
+        <w:bidi w:val="1"/>
+      </w:pPr>
+      <w:r>
+        <w:rPr>
+          <w:rtl w:val="1"/>
+          <w:szCs w:val="21"/>
+        </w:rPr>
+        <w:t xml:space="preserve">بین </w:t>
+      </w:r>
+      <w:r>
+        <w:rPr>
+          <w:rtl w:val="0"/>
+          <w:szCs w:val="21"/>
+        </w:rPr>
+        <w:t>inner join</w:t>
+      </w:r>
+      <w:r>
+        <w:rPr>
+          <w:rtl w:val="1"/>
+          <w:szCs w:val="21"/>
+        </w:rPr>
+        <w:t xml:space="preserve"> و </w:t>
+      </w:r>
+      <w:r>
+        <w:rPr>
+          <w:rtl w:val="0"/>
+          <w:szCs w:val="21"/>
+        </w:rPr>
+        <w:t>left join</w:t>
+      </w:r>
+      <w:r>
+        <w:rPr>
+          <w:rtl w:val="1"/>
+          <w:szCs w:val="21"/>
+        </w:rPr>
+        <w:t xml:space="preserve">، اتصال چپ با نگاشت یکتای </w:t>
+      </w:r>
+      <w:r>
+        <w:rPr>
+          <w:rtl w:val="0"/>
+          <w:szCs w:val="21"/>
+        </w:rPr>
+        <w:t>ZIP</w:t>
+      </w:r>
+      <w:r>
+        <w:rPr>
+          <w:rtl w:val="1"/>
+          <w:szCs w:val="21"/>
+        </w:rPr>
+        <w:t xml:space="preserve"> به </w:t>
+      </w:r>
+      <w:r>
+        <w:rPr>
+          <w:rtl w:val="0"/>
+          <w:szCs w:val="21"/>
+        </w:rPr>
+        <w:t>MODZCTA</w:t>
+      </w:r>
+      <w:r>
+        <w:rPr>
+          <w:rtl w:val="1"/>
+          <w:szCs w:val="21"/>
+        </w:rPr>
+        <w:t xml:space="preserve"> انتخاب شد. حذف موارد بدون مرجع، پوشش پرونده‌ها را بی‌صدا تغییر می‌داد. یک مرجع مستقل و </w:t>
+      </w:r>
+      <w:r>
+        <w:rPr>
+          <w:rtl w:val="0"/>
+          <w:szCs w:val="21"/>
+        </w:rPr>
+        <w:t>pin</w:t>
+      </w:r>
+      <w:r>
+        <w:rPr>
+          <w:rtl w:val="1"/>
+          <w:szCs w:val="21"/>
+        </w:rPr>
+        <w:t xml:space="preserve"> شده به </w:t>
+      </w:r>
+      <w:r>
+        <w:rPr>
+          <w:rtl w:val="0"/>
+          <w:szCs w:val="21"/>
+        </w:rPr>
+        <w:t>commit</w:t>
+      </w:r>
+      <w:r>
+        <w:rPr>
+          <w:rtl w:val="1"/>
+          <w:szCs w:val="21"/>
+        </w:rPr>
+        <w:t xml:space="preserve"> و هش مشخص استفاده می‌شود؛ چند </w:t>
+      </w:r>
+      <w:r>
+        <w:rPr>
+          <w:rtl w:val="0"/>
+          <w:szCs w:val="21"/>
+        </w:rPr>
+        <w:t>ZIP</w:t>
+      </w:r>
+      <w:r>
+        <w:rPr>
+          <w:rtl w:val="1"/>
+          <w:szCs w:val="21"/>
+        </w:rPr>
+        <w:t xml:space="preserve"> مشترک، جمعیت یک ناحیه را تکثیر نمی‌کنند. تعداد سطر قبل و بعد برابر است. در خروجی فعلی، ۶۷ پرونده </w:t>
+      </w:r>
+      <w:r>
+        <w:rPr>
+          <w:rtl w:val="0"/>
+          <w:szCs w:val="21"/>
+        </w:rPr>
+        <w:t>ZIP</w:t>
+      </w:r>
+      <w:r>
+        <w:rPr>
+          <w:rtl w:val="1"/>
+          <w:szCs w:val="21"/>
+        </w:rPr>
+        <w:t xml:space="preserve"> خالی و ۲۶۱ پرونده </w:t>
+      </w:r>
+      <w:r>
+        <w:rPr>
+          <w:rtl w:val="0"/>
+          <w:szCs w:val="21"/>
+        </w:rPr>
+        <w:t>ZIP</w:t>
+      </w:r>
+      <w:r>
+        <w:rPr>
+          <w:rtl w:val="1"/>
+          <w:szCs w:val="21"/>
+        </w:rPr>
+        <w:t xml:space="preserve"> بدون تطابق دارند؛ ۷۷ اختلاف </w:t>
+      </w:r>
+      <w:r>
+        <w:rPr>
+          <w:rtl w:val="0"/>
+          <w:szCs w:val="21"/>
+        </w:rPr>
+        <w:t>borough</w:t>
+      </w:r>
+      <w:r>
+        <w:rPr>
+          <w:rtl w:val="1"/>
+          <w:szCs w:val="21"/>
+        </w:rPr>
+        <w:t xml:space="preserve"> هم حفظ و علامت‌گذاری شده است. این موارد فقط در صورت نرخ نامعتبر کنار گذاشته می‌شوند. بهای انتخاب، استفاده از جمعیت تاریخی ۲۰۱۹ و ناتوانی در ساخت مخرج دقیق برای دامنهٔ محدود به </w:t>
+      </w:r>
+      <w:r>
+        <w:rPr>
+          <w:rtl w:val="0"/>
+          <w:szCs w:val="21"/>
+        </w:rPr>
+        <w:t>borough</w:t>
+      </w:r>
+      <w:r>
+        <w:rPr>
+          <w:rtl w:val="1"/>
+          <w:szCs w:val="21"/>
+        </w:rPr>
+        <w:t xml:space="preserve"> است.</w:t>
+      </w:r>
+    </w:p>
+    <w:p>
+      <w:pPr>
+        <w:pStyle w:val="Heading2"/>
+        <w:spacing w:before="160"/>
+        <w:jc w:val="start"/>
+        <w:keepNext/>
+        <w:keepLines/>
+        <w:widowControl/>
+        <w:bidi w:val="1"/>
+      </w:pPr>
+      <w:r>
+        <w:rPr>
+          <w:rtl w:val="1"/>
+          <w:szCs w:val="23"/>
+          <w:bCs w:val="1"/>
+        </w:rPr>
+        <w:t>ماه ایجاد پرونده و تفکیک ماه ناقص</w:t>
+      </w:r>
+    </w:p>
+    <w:p>
+      <w:pPr>
+        <w:jc w:val="start"/>
+        <w:keepLines/>
+        <w:widowControl/>
+        <w:bidi w:val="1"/>
+      </w:pPr>
+      <w:r>
+        <w:rPr>
+          <w:rtl w:val="1"/>
+          <w:szCs w:val="21"/>
+        </w:rPr>
+        <w:t xml:space="preserve">می‌توانستیم برحسب ماه بسته‌شدن یا ماه ایجاد گروه‌بندی کنیم. ماه ایجاد برای دنبال‌کردن </w:t>
+      </w:r>
+      <w:r>
+        <w:rPr>
+          <w:rtl w:val="0"/>
+          <w:szCs w:val="21"/>
+        </w:rPr>
+        <w:t>cohort</w:t>
+      </w:r>
+      <w:r>
+        <w:rPr>
+          <w:rtl w:val="1"/>
+          <w:szCs w:val="21"/>
+        </w:rPr>
+        <w:t xml:space="preserve"> درخواست‌ها انتخاب شد. مدت فقط برای پایان‌های ثبت‌شده محاسبه می‌شود؛ میانگین و میانه همراه تعداد پایان موجود و خالی می‌آیند. ماه دریافت‌نشده خالی می‌ماند و ماه ناقص نرخ ندارد. جمعیت هر ناحیه یک‌بار مخرج است. بهای این انتخاب، حساسیت مقایسهٔ ماه‌های جدید به فرصت پیگیری و پرونده‌های هنوز باز است؛ کاهش تعداد ماه ناقص هم شاهد بهبود وضع شهر نیست.</w:t>
+      </w:r>
+    </w:p>
+    <w:p>
+      <w:pPr>
+        <w:pStyle w:val="Heading2"/>
+        <w:spacing w:before="160"/>
+        <w:jc w:val="start"/>
+        <w:keepNext/>
+        <w:keepLines/>
+        <w:widowControl/>
+        <w:bidi w:val="1"/>
+      </w:pPr>
+      <w:r>
+        <w:rPr>
+          <w:rtl w:val="1"/>
+          <w:szCs w:val="23"/>
+          <w:bCs w:val="1"/>
+        </w:rPr>
+        <w:t>قطعی‌بودن فایل تحلیلی با زمان واقعی حسابرسی</w:t>
+      </w:r>
+    </w:p>
+    <w:p>
+      <w:pPr>
+        <w:jc w:val="start"/>
+        <w:keepLines/>
+        <w:widowControl/>
+        <w:bidi w:val="1"/>
+      </w:pPr>
+      <w:r>
+        <w:rPr>
+          <w:rtl w:val="1"/>
+          <w:szCs w:val="21"/>
+        </w:rPr>
+        <w:t xml:space="preserve">ثبت زمان واقعی اجرای مستقل و داشتن هش یکسان برای همان </w:t>
+      </w:r>
+      <w:r>
+        <w:rPr>
+          <w:rtl w:val="0"/>
+          <w:szCs w:val="21"/>
+        </w:rPr>
+        <w:t>manifest</w:t>
+      </w:r>
+      <w:r>
+        <w:rPr>
+          <w:rtl w:val="1"/>
+          <w:szCs w:val="21"/>
+        </w:rPr>
+        <w:t xml:space="preserve"> هم‌زمان شدنی نیست. فایل‌های تحلیلی و گزارش تحلیلی برای ورودی، تنظیمات و کد یکسان بایت یکسان دارند؛ </w:t>
+      </w:r>
+      <w:r>
+        <w:rPr>
+          <w:rtl w:val="0"/>
+          <w:szCs w:val="21"/>
+        </w:rPr>
+        <w:t>manifest</w:t>
+      </w:r>
+      <w:r>
+        <w:rPr>
+          <w:rtl w:val="1"/>
+          <w:szCs w:val="21"/>
+        </w:rPr>
+        <w:t xml:space="preserve"> هر اجرا زمان و شناسهٔ واقعی خودش را نگه می‌دارد. اجرای مستقل دوم و مقابلهٔ هش‌ها در نوت‌بوک ثبت شده است. بهای این تصمیم، استثنای صریح </w:t>
+      </w:r>
+      <w:r>
+        <w:rPr>
+          <w:rtl w:val="0"/>
+          <w:szCs w:val="21"/>
+        </w:rPr>
+        <w:t>manifest</w:t>
+      </w:r>
+      <w:r>
+        <w:rPr>
+          <w:rtl w:val="1"/>
+          <w:szCs w:val="21"/>
+        </w:rPr>
+        <w:t xml:space="preserve"> از الزام هش ثابت است. تعداد واقعی تلاش‌های </w:t>
+      </w:r>
+      <w:r>
+        <w:rPr>
+          <w:rtl w:val="0"/>
+          <w:szCs w:val="21"/>
+        </w:rPr>
+        <w:t>HTTP</w:t>
+      </w:r>
+      <w:r>
+        <w:rPr>
+          <w:rtl w:val="1"/>
+          <w:szCs w:val="21"/>
+        </w:rPr>
+        <w:t xml:space="preserve"> نیز فقط برای همان اجرای کارخانه ثبت می‌شود؛ درخواست‌های تاریخی از تعداد </w:t>
+      </w:r>
+      <w:r>
+        <w:rPr>
+          <w:rtl w:val="0"/>
+          <w:szCs w:val="21"/>
+        </w:rPr>
+        <w:t>batch</w:t>
+      </w:r>
+      <w:r>
+        <w:rPr>
+          <w:rtl w:val="1"/>
+          <w:szCs w:val="21"/>
+        </w:rPr>
+        <w:t>ها حدس زده نمی‌شوند.</w:t>
+      </w:r>
+    </w:p>
+    <w:p>
+      <w:pPr>
+        <w:pStyle w:val="Heading1"/>
+        <w:spacing w:before="160"/>
+        <w:jc w:val="start"/>
+        <w:keepNext/>
+        <w:keepLines/>
+        <w:widowControl/>
+        <w:bidi w:val="1"/>
+      </w:pPr>
+      <w:r>
+        <w:rPr>
+          <w:rtl w:val="1"/>
+          <w:szCs w:val="23"/>
+          <w:bCs w:val="1"/>
+        </w:rPr>
+        <w:t>شواهد تحلیل و تصمیم دربارهٔ دورافتاده‌ها</w:t>
+      </w:r>
+    </w:p>
+    <w:p>
+      <w:pPr>
+        <w:jc w:val="start"/>
+        <w:keepLines/>
+        <w:widowControl/>
+        <w:bidi w:val="1"/>
+      </w:pPr>
+      <w:r>
+        <w:rPr>
+          <w:rtl w:val="1"/>
+          <w:szCs w:val="21"/>
+        </w:rPr>
+        <w:t xml:space="preserve">میانگین مدت </w:t>
+      </w:r>
+      <w:r>
+        <w:rPr>
+          <w:rtl w:val="0"/>
+          <w:szCs w:val="21"/>
+        </w:rPr>
+        <w:t>1.24</w:t>
+      </w:r>
+      <w:r>
+        <w:rPr>
+          <w:rtl w:val="1"/>
+          <w:szCs w:val="21"/>
+        </w:rPr>
+        <w:t xml:space="preserve"> ساعت و میانه </w:t>
+      </w:r>
+      <w:r>
+        <w:rPr>
+          <w:rtl w:val="0"/>
+          <w:szCs w:val="21"/>
+        </w:rPr>
+        <w:t>0.62</w:t>
+      </w:r>
+      <w:r>
+        <w:rPr>
+          <w:rtl w:val="1"/>
+          <w:szCs w:val="21"/>
+        </w:rPr>
+        <w:t xml:space="preserve"> ساعت است؛ صدک ۹۹ به </w:t>
+      </w:r>
+      <w:r>
+        <w:rPr>
+          <w:rtl w:val="0"/>
+          <w:szCs w:val="21"/>
+        </w:rPr>
+        <w:t>10.06</w:t>
+      </w:r>
+      <w:r>
+        <w:rPr>
+          <w:rtl w:val="1"/>
+          <w:szCs w:val="21"/>
+        </w:rPr>
+        <w:t xml:space="preserve"> ساعت می‌رسد. توزیع متقارن نیست و اتکا به میانگین، پروندهٔ معمول را خوب توصیف نمی‌کند.</w:t>
+      </w:r>
+    </w:p>
+    <w:p>
+      <w:pPr>
+        <w:jc w:val="start"/>
+        <w:keepLines/>
+        <w:widowControl/>
+        <w:bidi w:val="1"/>
+      </w:pPr>
+      <w:r>
+        <w:rPr>
+          <w:rtl w:val="1"/>
+          <w:szCs w:val="21"/>
+        </w:rPr>
+        <w:t xml:space="preserve">بیشترین میانه مربوط به </w:t>
+      </w:r>
+      <w:r>
+        <w:rPr>
+          <w:rtl w:val="0"/>
+          <w:szCs w:val="21"/>
+        </w:rPr>
+        <w:t>Noise - Residential</w:t>
+      </w:r>
+      <w:r>
+        <w:rPr>
+          <w:rtl w:val="1"/>
+          <w:szCs w:val="21"/>
+        </w:rPr>
+        <w:t xml:space="preserve"> با </w:t>
+      </w:r>
+      <w:r>
+        <w:rPr>
+          <w:rtl w:val="0"/>
+          <w:szCs w:val="21"/>
+        </w:rPr>
+        <w:t>0.66</w:t>
+      </w:r>
+      <w:r>
+        <w:rPr>
+          <w:rtl w:val="1"/>
+          <w:szCs w:val="21"/>
+        </w:rPr>
+        <w:t xml:space="preserve"> ساعت و کمترین مربوط به </w:t>
+      </w:r>
+      <w:r>
+        <w:rPr>
+          <w:rtl w:val="0"/>
+          <w:szCs w:val="21"/>
+        </w:rPr>
+        <w:t>Noise - Commercial</w:t>
+      </w:r>
+      <w:r>
+        <w:rPr>
+          <w:rtl w:val="1"/>
+          <w:szCs w:val="21"/>
+        </w:rPr>
+        <w:t xml:space="preserve"> با </w:t>
+      </w:r>
+      <w:r>
+        <w:rPr>
+          <w:rtl w:val="0"/>
+          <w:szCs w:val="21"/>
+        </w:rPr>
+        <w:t>0.54</w:t>
+      </w:r>
+      <w:r>
+        <w:rPr>
+          <w:rtl w:val="1"/>
+          <w:szCs w:val="21"/>
+        </w:rPr>
+        <w:t xml:space="preserve"> ساعت است؛ یک آمار مشترک تفاوت نوع شکایت را پنهان می‌کند.</w:t>
+      </w:r>
+    </w:p>
+    <w:p>
+      <w:pPr>
+        <w:jc w:val="start"/>
+        <w:keepLines/>
+        <w:widowControl/>
+        <w:bidi w:val="1"/>
+      </w:pPr>
+      <w:r>
+        <w:rPr>
+          <w:rtl w:val="1"/>
+          <w:szCs w:val="21"/>
+        </w:rPr>
+        <w:t xml:space="preserve">ناحیهٔ دارای بیشترین تعداد خام </w:t>
+      </w:r>
+      <w:r>
+        <w:rPr>
+          <w:rtl w:val="0"/>
+          <w:szCs w:val="21"/>
+        </w:rPr>
+        <w:t>MODZCTA:10456</w:t>
+      </w:r>
+      <w:r>
+        <w:rPr>
+          <w:rtl w:val="1"/>
+          <w:szCs w:val="21"/>
+        </w:rPr>
+        <w:t xml:space="preserve"> و ناحیهٔ دارای بیشترین نرخ </w:t>
+      </w:r>
+      <w:r>
+        <w:rPr>
+          <w:rtl w:val="0"/>
+          <w:szCs w:val="21"/>
+        </w:rPr>
+        <w:t>MODZCTA:10004</w:t>
+      </w:r>
+      <w:r>
+        <w:rPr>
+          <w:rtl w:val="1"/>
+          <w:szCs w:val="21"/>
+        </w:rPr>
+        <w:t xml:space="preserve"> است. رتبه‌بندی برحسب حجم و برحسب جمعیت متفاوت است؛ نرخ‌ها فقط مربوط به ماه‌های کامل و مخرج تاریخی‌اند.</w:t>
+      </w:r>
+    </w:p>
+    <w:p>
+      <w:pPr>
+        <w:jc w:val="start"/>
+        <w:keepLines/>
+        <w:widowControl/>
+        <w:bidi w:val="1"/>
+      </w:pPr>
+      <w:r>
+        <w:rPr>
+          <w:rtl w:val="1"/>
+          <w:szCs w:val="21"/>
+        </w:rPr>
+        <w:t xml:space="preserve">مدت مثبت بسیار طولانی صرفاً به دلیل عبور از مرز </w:t>
+      </w:r>
+      <w:r>
+        <w:rPr>
+          <w:rtl w:val="0"/>
+          <w:szCs w:val="21"/>
+        </w:rPr>
+        <w:t>IQR</w:t>
+      </w:r>
+      <w:r>
+        <w:rPr>
+          <w:rtl w:val="1"/>
+          <w:szCs w:val="21"/>
+        </w:rPr>
+        <w:t xml:space="preserve"> حذف نشده است. این مرز برای توصیف مناسب است، اما در توزیع نامتقارن اثبات خطا نیست. حذف خودکار، تجربهٔ پرونده‌های دیر‌بسته‌شده را پنهان می‌کند. نمودار لگاریتمی و مقایسهٔ میانه با صدک‌های بالا، خوانایی را بهتر می‌کنند و دادهٔ تحلیلی را تغییر نمی‌دهند. ماتریس رابطهٔ رتبه‌ای متغیرهای عددی و مقایسهٔ نوع شکایت نیز در </w:t>
+      </w:r>
+      <w:r>
+        <w:rPr>
+          <w:rtl w:val="0"/>
+          <w:szCs w:val="21"/>
+        </w:rPr>
+        <w:t>EDA</w:t>
+      </w:r>
+      <w:r>
+        <w:rPr>
+          <w:rtl w:val="1"/>
+          <w:szCs w:val="21"/>
+        </w:rPr>
+        <w:t xml:space="preserve"> قرار دارند.</w:t>
+      </w:r>
+    </w:p>
+    <w:p>
+      <w:pPr>
+        <w:pStyle w:val="Heading1"/>
+        <w:spacing w:before="160"/>
+        <w:jc w:val="start"/>
+        <w:keepNext/>
+        <w:keepLines/>
+        <w:widowControl/>
+        <w:bidi w:val="1"/>
+      </w:pPr>
+      <w:r>
+        <w:rPr>
+          <w:rtl w:val="1"/>
+          <w:szCs w:val="23"/>
+          <w:bCs w:val="1"/>
+        </w:rPr>
+        <w:t>مسیرهای کنارگذاشته‌شده و محدودیت‌ها</w:t>
+      </w:r>
+    </w:p>
+    <w:p>
+      <w:pPr>
+        <w:jc w:val="start"/>
+        <w:keepLines/>
+        <w:widowControl/>
+        <w:bidi w:val="1"/>
+      </w:pPr>
+      <w:r>
+        <w:rPr>
+          <w:rtl w:val="1"/>
+          <w:szCs w:val="21"/>
+        </w:rPr>
+        <w:t xml:space="preserve">فیلتر فقط </w:t>
+      </w:r>
+      <w:r>
+        <w:rPr>
+          <w:rtl w:val="0"/>
+          <w:szCs w:val="21"/>
         </w:rPr>
         <w:t>BROOKLYN</w:t>
       </w:r>
       <w:r>
         <w:rPr>
-          <w:rFonts w:hint="cs"/>
-          <w:szCs w:val="21"/>
-          <w:rtl/>
-          <w:lang w:bidi="fa-IR"/>
-        </w:rPr>
-        <w:t xml:space="preserve"> قرار دادم ولی یک عیبی که داشت این بود که دیگه مقای</w:t>
-      </w:r>
-      <w:r>
-        <w:rPr>
-          <w:rFonts w:hint="cs"/>
-          <w:szCs w:val="21"/>
-          <w:rtl/>
-          <w:lang w:bidi="fa-IR"/>
-        </w:rPr>
-        <w:t>س</w:t>
-      </w:r>
-      <w:r>
-        <w:rPr>
-          <w:rFonts w:hint="cs"/>
-          <w:szCs w:val="21"/>
-          <w:rtl/>
-          <w:lang w:bidi="fa-IR"/>
-        </w:rPr>
-        <w:t xml:space="preserve">ه منطقه مکانی در جاهای مختلف نیویورک قایل مقایسه نبود و یا برای اساس نوع </w:t>
-      </w:r>
-      <w:r>
-        <w:rPr>
-          <w:szCs w:val="21"/>
-          <w:lang w:bidi="fa-IR"/>
-        </w:rPr>
-        <w:t xml:space="preserve">agency </w:t>
-      </w:r>
-      <w:r>
-        <w:rPr>
-          <w:rFonts w:hint="cs"/>
-          <w:szCs w:val="21"/>
-          <w:rtl/>
-          <w:lang w:bidi="fa-IR"/>
-        </w:rPr>
-        <w:t xml:space="preserve"> جدا کردم که چون هر </w:t>
-      </w:r>
-      <w:r>
-        <w:rPr>
-          <w:szCs w:val="21"/>
-          <w:lang w:bidi="fa-IR"/>
-        </w:rPr>
-        <w:t xml:space="preserve">agency </w:t>
-      </w:r>
-      <w:r>
-        <w:rPr>
-          <w:rFonts w:hint="cs"/>
-          <w:szCs w:val="21"/>
-          <w:rtl/>
-          <w:lang w:bidi="fa-IR"/>
-        </w:rPr>
-        <w:t xml:space="preserve"> یک نوع سازمان برای رسیدگی به یک نوع شکایات محدود هست لذا این مانند پرداختن به یک نوع خاصی از شکایات هست که البته الان هم تنها نوع خاص شکایات مربوط به سروصدا ملاک قرار میگیرد که همانطور که پیداست </w:t>
-      </w:r>
-      <w:r>
-        <w:rPr>
-          <w:szCs w:val="21"/>
-          <w:lang w:bidi="fa-IR"/>
-        </w:rPr>
-        <w:t xml:space="preserve">agency </w:t>
-      </w:r>
-      <w:r>
-        <w:rPr>
-          <w:rFonts w:hint="cs"/>
-          <w:szCs w:val="21"/>
-          <w:rtl/>
-          <w:lang w:bidi="fa-IR"/>
-        </w:rPr>
-        <w:t xml:space="preserve"> انها تا جایی که من الان دارم مشاهده میکنم یکیع. پس این یک تصمیم هست که شاید در چالش های بعدی برای پاسخ به سوال اصلی تغییر کنه!</w:t>
-      </w:r>
-    </w:p>
-    <w:p>
-      <w:pPr>
-        <w:bidi/>
-        <w:spacing w:after="120" w:line="293" w:lineRule="auto"/>
-        <w:rPr>
-          <w:szCs w:val="21"/>
-          <w:rtl/>
-          <w:lang w:val="fa-IR" w:bidi="fa-IR"/>
-        </w:rPr>
-      </w:pPr>
-      <w:r>
-        <w:rPr>
-          <w:rFonts w:hint="cs"/>
-          <w:szCs w:val="21"/>
-          <w:rtl/>
-          <w:lang w:val="fa-IR" w:bidi="fa-IR"/>
-        </w:rPr>
-        <w:t xml:space="preserve">ولی بازم </w:t>
-      </w:r>
-      <w:r>
-        <w:rPr>
-          <w:szCs w:val="21"/>
-          <w:rtl/>
-          <w:lang w:val="fa-IR" w:bidi="fa-IR"/>
-        </w:rPr>
-        <w:t xml:space="preserve">این انتخاب شامل همه گروه‌های سر‌وصدا نیست؛ دسته عمومی </w:t>
-      </w:r>
-      <w:r>
-        <w:rPr>
-          <w:szCs w:val="21"/>
-          <w:lang w:val="fa-IR" w:bidi="fa-IR"/>
-        </w:rPr>
-        <w:t>Noise</w:t>
-      </w:r>
-      <w:r>
-        <w:rPr>
-          <w:szCs w:val="21"/>
-          <w:rtl/>
-          <w:lang w:val="fa-IR" w:bidi="fa-IR"/>
-        </w:rPr>
-        <w:t>، شکایت‌های بالگرد و اماکن مذهبی خارج از دامنه‌اند. بنابراین نتایج به همین پنج گروه تعمیم دارند. پرونده‌های باز از ابتدا کنار گذاشته نشده‌اند تا انتخاب داده به نتیجه رسیدگی وابسته نشود. حداقل ۳۰۰ هزار، شرط کف حجم است؛ دامنه دریافت با فیلتر تعریف می‌شود و در رکورد سیصدهزارم قطع نمی‌شود.</w:t>
-      </w:r>
-    </w:p>
-    <w:p>
-      <w:pPr>
-        <w:bidi/>
-        <w:spacing w:after="120" w:line="293" w:lineRule="auto"/>
-        <w:rPr>
-          <w:rFonts w:hint="cs"/>
-          <w:rtl/>
-        </w:rPr>
-      </w:pPr>
-      <w:r>
-        <w:rPr>
-          <w:rFonts w:hint="cs"/>
-          <w:szCs w:val="21"/>
-          <w:rtl/>
-          <w:lang w:val="fa-IR" w:bidi="fa-IR"/>
-        </w:rPr>
-        <w:t xml:space="preserve">خلاصه هر نوع انتخاب برای محدود سازی یک عیبی میتونست در انتها ایجاد کنه و ما باید بر اساس هدف نهاییمون از </w:t>
-      </w:r>
-      <w:r>
-        <w:rPr>
-          <w:szCs w:val="21"/>
-          <w:lang w:bidi="fa-IR"/>
-        </w:rPr>
-        <w:t xml:space="preserve">data gathering </w:t>
-      </w:r>
-      <w:r>
-        <w:rPr>
-          <w:rFonts w:hint="cs"/>
-          <w:szCs w:val="21"/>
-          <w:rtl/>
-          <w:lang w:bidi="fa-IR"/>
-        </w:rPr>
-        <w:t xml:space="preserve"> انتخابی داشته باشیم که کمترین محدودیت رو برای تحلیل هامون ایجاد کنه.</w:t>
-      </w:r>
-    </w:p>
-    <w:p>
-      <w:pPr>
-        <w:pStyle w:val="Heading2"/>
-        <w:bidi/>
-        <w:spacing w:before="80" w:after="100" w:line="293" w:lineRule="auto"/>
-      </w:pPr>
-      <w:r>
-        <w:rPr>
-          <w:rFonts w:ascii="Tahoma" w:eastAsia="Tahoma" w:hAnsi="Tahoma" w:cs="Tahoma"/>
-          <w:b/>
-          <w:bCs/>
-          <w:sz w:val="23"/>
+          <w:rtl w:val="1"/>
+          <w:szCs w:val="21"/>
+        </w:rPr>
+        <w:t xml:space="preserve"> کنار گذاشته شد، چون مقایسهٔ مناطق را محدود می‌کرد. پیوند مستندات </w:t>
+      </w:r>
+      <w:r>
+        <w:rPr>
+          <w:rtl w:val="0"/>
+          <w:szCs w:val="21"/>
+        </w:rPr>
+        <w:t>Socrata</w:t>
+      </w:r>
+      <w:r>
+        <w:rPr>
+          <w:rtl w:val="1"/>
+          <w:szCs w:val="21"/>
+        </w:rPr>
+        <w:t xml:space="preserve"> هم جای </w:t>
+      </w:r>
+      <w:r>
+        <w:rPr>
+          <w:rtl w:val="0"/>
+          <w:szCs w:val="21"/>
+        </w:rPr>
+        <w:t>endpoint</w:t>
+      </w:r>
+      <w:r>
+        <w:rPr>
+          <w:rtl w:val="1"/>
+          <w:szCs w:val="21"/>
+        </w:rPr>
+        <w:t xml:space="preserve"> داده نیست؛ پاسخ </w:t>
+      </w:r>
+      <w:r>
+        <w:rPr>
+          <w:rtl w:val="0"/>
+          <w:szCs w:val="21"/>
+        </w:rPr>
+        <w:t>HTML</w:t>
+      </w:r>
+      <w:r>
+        <w:rPr>
+          <w:rtl w:val="1"/>
+          <w:szCs w:val="21"/>
+        </w:rPr>
+        <w:t xml:space="preserve"> نمی‌تواند </w:t>
+      </w:r>
+      <w:r>
+        <w:rPr>
+          <w:rtl w:val="0"/>
+          <w:szCs w:val="21"/>
+        </w:rPr>
+        <w:t>JSON</w:t>
+      </w:r>
+      <w:r>
+        <w:rPr>
+          <w:rtl w:val="1"/>
+          <w:szCs w:val="21"/>
+        </w:rPr>
+        <w:t xml:space="preserve"> پرونده باشد. در آماده‌سازی فعلی، ادامهٔ دریافت از منبع زنده با رد دسترسی متوقف شد و دادهٔ قبلی حفظ شد. پاسخ شبکه به دادهٔ ساختگی، </w:t>
+      </w:r>
+      <w:r>
+        <w:rPr>
+          <w:rtl w:val="0"/>
+          <w:szCs w:val="21"/>
+        </w:rPr>
+        <w:t>checkpoint</w:t>
+      </w:r>
+      <w:r>
+        <w:rPr>
+          <w:rtl w:val="1"/>
+          <w:szCs w:val="21"/>
+        </w:rPr>
+        <w:t xml:space="preserve"> کامل یا ماه‌های صفر تبدیل نشده است.</w:t>
+      </w:r>
+    </w:p>
+    <w:p>
+      <w:pPr>
+        <w:jc w:val="start"/>
+        <w:keepLines/>
+        <w:widowControl/>
+        <w:bidi w:val="1"/>
+      </w:pPr>
+      <w:r>
+        <w:rPr>
+          <w:rtl w:val="1"/>
+          <w:szCs w:val="21"/>
+        </w:rPr>
+        <w:t xml:space="preserve">مجموعهٔ آزمون‌ها شامل </w:t>
+      </w:r>
+      <w:r>
+        <w:rPr>
+          <w:rtl w:val="0"/>
+          <w:szCs w:val="21"/>
+        </w:rPr>
+        <w:t>148</w:t>
+      </w:r>
+      <w:r>
+        <w:rPr>
+          <w:rtl w:val="1"/>
+          <w:szCs w:val="21"/>
+        </w:rPr>
+        <w:t xml:space="preserve"> تست است و با منع </w:t>
+      </w:r>
+      <w:r>
+        <w:rPr>
+          <w:rtl w:val="0"/>
+          <w:szCs w:val="21"/>
+        </w:rPr>
+        <w:t>DNS</w:t>
+      </w:r>
+      <w:r>
+        <w:rPr>
+          <w:rtl w:val="1"/>
+          <w:szCs w:val="21"/>
+        </w:rPr>
+        <w:t xml:space="preserve"> و اتصال خروجی پاس شده است. این شاهد، منطق کارخانه را روی </w:t>
+      </w:r>
+      <w:r>
+        <w:rPr>
+          <w:rtl w:val="0"/>
+          <w:szCs w:val="21"/>
+        </w:rPr>
+        <w:t>fixture</w:t>
+      </w:r>
+      <w:r>
+        <w:rPr>
+          <w:rtl w:val="1"/>
+          <w:szCs w:val="21"/>
+        </w:rPr>
+        <w:t xml:space="preserve"> بررسی می‌کند؛ جایگزین تأیید کامل دریافت زنده نیست. دسترسی منبع برای تکمیل بازه باید برقرار شود. شاهد یک </w:t>
+      </w:r>
+      <w:r>
+        <w:rPr>
+          <w:rtl w:val="0"/>
+          <w:szCs w:val="21"/>
+        </w:rPr>
+        <w:t>Pull Request</w:t>
+      </w:r>
+      <w:r>
+        <w:rPr>
+          <w:rtl w:val="1"/>
+          <w:szCs w:val="21"/>
+        </w:rPr>
+        <w:t xml:space="preserve"> ادغام‌شده هم در بررسی فعلی پیدا نشد. فایل‌های خام در </w:t>
+      </w:r>
+      <w:r>
+        <w:rPr>
+          <w:rtl w:val="0"/>
+          <w:szCs w:val="21"/>
+        </w:rPr>
+        <w:t>history</w:t>
+      </w:r>
+      <w:r>
+        <w:rPr>
+          <w:rtl w:val="1"/>
+          <w:szCs w:val="21"/>
+        </w:rPr>
+        <w:t xml:space="preserve"> مسیرهای دادهٔ </w:t>
+      </w:r>
+      <w:r>
+        <w:rPr>
+          <w:rtl w:val="0"/>
+          <w:szCs w:val="21"/>
+        </w:rPr>
+        <w:t>Git</w:t>
+      </w:r>
+      <w:r>
+        <w:rPr>
+          <w:rtl w:val="1"/>
+          <w:szCs w:val="21"/>
+        </w:rPr>
+        <w:t xml:space="preserve"> مشاهده نشدند و نباید برای رفع این دو مورد، تاریخچه بازسازی یا ادعای تحویل کامل ساخته شود.</w:t>
+      </w:r>
+    </w:p>
+    <w:p>
+      <w:pPr>
+        <w:jc w:val="start"/>
+        <w:keepLines/>
+        <w:widowControl/>
+        <w:bidi w:val="1"/>
+      </w:pPr>
+      <w:r>
+        <w:rPr>
+          <w:rtl w:val="1"/>
+          <w:szCs w:val="21"/>
+        </w:rPr>
+        <w:t xml:space="preserve">تغییر سیستماتیک نوع یا حذف فیلدهای ضروری اجرا را متوقف می‌کند. معنای دسته‌ها، تغییرات دیرهنگام پرونده‌ها، خطای جغرافیایی </w:t>
+      </w:r>
+      <w:r>
+        <w:rPr>
+          <w:rtl w:val="0"/>
+          <w:szCs w:val="21"/>
+        </w:rPr>
+        <w:t>ZIP</w:t>
+      </w:r>
+      <w:r>
+        <w:rPr>
+          <w:rtl w:val="1"/>
+          <w:szCs w:val="21"/>
+        </w:rPr>
+        <w:t xml:space="preserve"> و قدمت مخرج جمعیت همچنان ریسک‌اند. </w:t>
+      </w:r>
+      <w:r>
+        <w:rPr>
+          <w:rtl w:val="0"/>
+          <w:szCs w:val="21"/>
+        </w:rPr>
+        <w:t>snapshot</w:t>
+      </w:r>
+      <w:r>
+        <w:rPr>
+          <w:rtl w:val="1"/>
+          <w:szCs w:val="21"/>
+        </w:rPr>
+        <w:t xml:space="preserve"> ناقص هم فقط دربارهٔ بخش دریافت‌شده اطلاع می‌دهد. نصب وابستگی‌ها و دریافت اولیه به شبکه وابسته‌اند؛ بازپردازش و تست‌ها با دادهٔ ذخیره‌شده آفلاین انجام می‌شوند.</w:t>
+      </w:r>
+    </w:p>
+    <w:p>
+      <w:pPr>
+        <w:pStyle w:val="Heading1"/>
+        <w:spacing w:before="160"/>
+        <w:jc w:val="start"/>
+        <w:keepNext/>
+        <w:keepLines/>
+        <w:widowControl/>
+        <w:bidi w:val="1"/>
+      </w:pPr>
+      <w:r>
+        <w:rPr>
+          <w:rtl w:val="1"/>
           <w:szCs w:val="23"/>
-          <w:rtl/>
-          <w:lang w:val="fa-IR" w:bidi="fa-IR"/>
-        </w:rPr>
-        <w:t>استفاده از دستیار هوش مصنوعی</w:t>
-      </w:r>
-    </w:p>
-    <w:p>
-      <w:pPr>
-        <w:bidi/>
-        <w:spacing w:after="120" w:line="293" w:lineRule="auto"/>
-        <w:rPr>
-          <w:sz w:val="18"/>
-          <w:szCs w:val="18"/>
-          <w:rtl/>
-          <w:lang w:val="fa-IR" w:bidi="fa-IR"/>
-        </w:rPr>
-      </w:pPr>
-      <w:r>
-        <w:rPr>
-          <w:sz w:val="18"/>
-          <w:szCs w:val="18"/>
-          <w:rtl/>
-          <w:lang w:val="fa-IR" w:bidi="fa-IR"/>
-        </w:rPr>
-        <w:t>برای بررسی گزینه‌های محدودسازی و تنظیم یادداشت شناخت داده و خلاصه تصمیم‌ها از دستیار هوش مصنوعی کمک گرفت</w:t>
-      </w:r>
-      <w:r>
-        <w:rPr>
-          <w:rFonts w:hint="cs"/>
-          <w:sz w:val="18"/>
-          <w:szCs w:val="18"/>
-          <w:rtl/>
-          <w:lang w:val="fa-IR" w:bidi="fa-IR"/>
-        </w:rPr>
-        <w:t>م.</w:t>
-      </w:r>
-    </w:p>
-    <w:p>
-      <w:pPr>
-        <w:bidi/>
-        <w:spacing w:after="120" w:line="293" w:lineRule="auto"/>
-        <w:ind w:left="360"/>
-        <w:rPr>
-          <w:rFonts w:hint="cs"/>
-          <w:rtl/>
-          <w:lang w:bidi="fa-IR"/>
-        </w:rPr>
-      </w:pPr>
-      <w:r>
-        <w:rPr>
-          <w:rFonts w:hint="cs"/>
-          <w:rtl/>
-          <w:lang w:bidi="fa-IR"/>
-        </w:rPr>
-        <w:t xml:space="preserve"> </w:t>
+          <w:bCs w:val="1"/>
+        </w:rPr>
+        <w:t>اگر دو روز دیگر وقت داشتیم</w:t>
+      </w:r>
+    </w:p>
+    <w:p>
+      <w:pPr>
+        <w:jc w:val="start"/>
+        <w:keepLines/>
+        <w:widowControl/>
+        <w:bidi w:val="1"/>
+      </w:pPr>
+      <w:r>
+        <w:rPr>
+          <w:rtl w:val="1"/>
+          <w:szCs w:val="21"/>
+        </w:rPr>
+        <w:t xml:space="preserve">اول دسترسی منبع و دریافت کامل بازه را تثبیت می‌کردیم و اجرای تازه و یک </w:t>
+      </w:r>
+      <w:r>
+        <w:rPr>
+          <w:rtl w:val="0"/>
+          <w:szCs w:val="21"/>
+        </w:rPr>
+        <w:t>Pull Request</w:t>
+      </w:r>
+      <w:r>
+        <w:rPr>
+          <w:rtl w:val="1"/>
+          <w:szCs w:val="21"/>
+        </w:rPr>
+        <w:t xml:space="preserve"> واقعی را ثبت می‌کردیم. سپس سیاست بازخوانی پرونده‌های قدیمیِ به‌روزشده و مرجع جمعیت هم‌زمان‌تر را بررسی می‌کردیم. برای انتقال به مرحلهٔ پایگاه داده، قرارداد هویت، زمان و قرنطینه ثابت می‌ماند و فقط لایهٔ مقصد اضافه می‌شد.</w:t>
+      </w:r>
+    </w:p>
+    <w:p>
+      <w:pPr>
+        <w:pStyle w:val="Heading1"/>
+        <w:spacing w:before="160"/>
+        <w:jc w:val="start"/>
+        <w:keepNext/>
+        <w:keepLines/>
+        <w:widowControl/>
+        <w:bidi w:val="1"/>
+      </w:pPr>
+      <w:r>
+        <w:rPr>
+          <w:rtl w:val="0"/>
+          <w:szCs w:val="23"/>
+          <w:bCs w:val="1"/>
+        </w:rPr>
+        <w:t>AI usage</w:t>
+      </w:r>
+    </w:p>
+    <w:p>
+      <w:pPr>
+        <w:jc w:val="start"/>
+        <w:keepLines/>
+        <w:widowControl/>
+        <w:bidi w:val="1"/>
+      </w:pPr>
+      <w:r>
+        <w:rPr>
+          <w:rtl w:val="1"/>
+          <w:szCs w:val="21"/>
+        </w:rPr>
+        <w:t xml:space="preserve">در تکمیل این نسخه از دستیار هوش مصنوعی برای بررسی الزامات، گسترش تست‌ها، تکمیل دریافت افزایشی و بودجهٔ درخواست، تنظیم </w:t>
+      </w:r>
+      <w:r>
+        <w:rPr>
+          <w:rtl w:val="0"/>
+          <w:szCs w:val="21"/>
+        </w:rPr>
+        <w:t>EDA</w:t>
+      </w:r>
+      <w:r>
+        <w:rPr>
+          <w:rtl w:val="1"/>
+          <w:szCs w:val="21"/>
+        </w:rPr>
+        <w:t xml:space="preserve"> و ویرایش گزارش کمک گرفته شده است. تنظیمات دامنه و شرح اولیهٔ مسئله از نسخهٔ موجود پروژه حفظ شده‌اند. شواهد، خروجی اجرای واقعی کد و آزمون‌ها هستند؛ این کمک، مسئولیت نویسنده برای فهم کد و دفاع از تصمیم‌ها را حذف نمی‌کند.</w:t>
       </w:r>
     </w:p>
     <w:sectPr>
@@ -981,7 +1537,7 @@
       <w:headerReference w:type="first" r:id="rId12"/>
       <w:footerReference w:type="first" r:id="rId13"/>
       <w:pgSz w:w="11906" w:h="16838"/>
-      <w:pgMar w:top="879" w:right="1020" w:bottom="879" w:left="1020" w:header="397" w:footer="397" w:gutter="0"/>
+      <w:pgMar w:top="935" w:right="1020" w:bottom="935" w:left="1020" w:header="397" w:footer="397" w:gutter="0"/>
       <w:cols w:space="720"/>
       <w:docGrid w:linePitch="360"/>
     </w:sectPr>
@@ -1626,8 +2182,12 @@
     <w:name w:val="Normal"/>
     <w:qFormat/>
     <w:rsid w:val="00B3074A"/>
+    <w:pPr>
+      <w:spacing w:line="312" w:lineRule="auto" w:after="140"/>
+    </w:pPr>
     <w:rPr>
       <w:rFonts w:ascii="Tahoma" w:eastAsia="Tahoma" w:hAnsi="Tahoma" w:cs="Tahoma"/>
+      <w:b w:val="0"/>
       <w:color w:val="000000"/>
       <w:sz w:val="21"/>
     </w:rPr>
@@ -1643,11 +2203,14 @@
     <w:pPr>
       <w:keepNext/>
       <w:keepLines/>
-      <w:spacing w:before="360" w:after="80"/>
+      <w:spacing w:before="360" w:after="140" w:line="312" w:lineRule="auto"/>
       <w:outlineLvl w:val="0"/>
     </w:pPr>
     <w:rPr>
-      <w:rFonts w:asciiTheme="majorHAnsi" w:eastAsiaTheme="majorEastAsia" w:hAnsiTheme="majorHAnsi" w:cstheme="majorBidi"/>
+      <w:rFonts w:asciiTheme="majorHAnsi" w:eastAsiaTheme="majorEastAsia" w:hAnsiTheme="majorHAnsi" w:cstheme="majorBidi" w:ascii="Tahoma" w:hAnsi="Tahoma" w:cs="Tahoma" w:eastAsia="Tahoma"/>
+      <w:b/>
+      <w:color w:val="000000"/>
+      <w:sz w:val="23"/>
       <w:szCs w:val="40"/>
     </w:rPr>
   </w:style>
@@ -1664,11 +2227,14 @@
     <w:pPr>
       <w:keepNext/>
       <w:keepLines/>
-      <w:spacing w:before="160" w:after="80"/>
+      <w:spacing w:before="160" w:after="140" w:line="312" w:lineRule="auto"/>
       <w:outlineLvl w:val="1"/>
     </w:pPr>
     <w:rPr>
-      <w:rFonts w:asciiTheme="majorHAnsi" w:eastAsiaTheme="majorEastAsia" w:hAnsiTheme="majorHAnsi" w:cstheme="majorBidi"/>
+      <w:rFonts w:asciiTheme="majorHAnsi" w:eastAsiaTheme="majorEastAsia" w:hAnsiTheme="majorHAnsi" w:cstheme="majorBidi" w:ascii="Tahoma" w:hAnsi="Tahoma" w:cs="Tahoma" w:eastAsia="Tahoma"/>
+      <w:b/>
+      <w:color w:val="000000"/>
+      <w:sz w:val="23"/>
       <w:szCs w:val="32"/>
     </w:rPr>
   </w:style>
@@ -1981,13 +2547,16 @@
     <w:qFormat/>
     <w:rsid w:val="00F47560"/>
     <w:pPr>
-      <w:spacing w:after="80" w:line="240" w:lineRule="auto"/>
+      <w:spacing w:after="140" w:line="312" w:lineRule="auto"/>
       <w:contextualSpacing/>
     </w:pPr>
     <w:rPr>
-      <w:rFonts w:asciiTheme="majorHAnsi" w:eastAsiaTheme="majorEastAsia" w:hAnsiTheme="majorHAnsi" w:cstheme="majorBidi"/>
+      <w:rFonts w:asciiTheme="majorHAnsi" w:eastAsiaTheme="majorEastAsia" w:hAnsiTheme="majorHAnsi" w:cstheme="majorBidi" w:ascii="Tahoma" w:hAnsi="Tahoma" w:cs="Tahoma" w:eastAsia="Tahoma"/>
+      <w:b/>
+      <w:color w:val="000000"/>
       <w:spacing w:val="-10"/>
       <w:kern w:val="28"/>
+      <w:sz w:val="26"/>
       <w:szCs w:val="56"/>
     </w:rPr>
   </w:style>

</xml_diff>